<commit_message>
Avance: Minería de datos, Prácticas Profesionales
De minería de datos hice un prototipo de la práctica 6, secuencias.
De Prácticas inicié el PIA
</commit_message>
<xml_diff>
--- a/Prácticas Profesionales/Producto Integrador de Aprendizaje.docx
+++ b/Prácticas Profesionales/Producto Integrador de Aprendizaje.docx
@@ -3,8 +3,2398 @@
 <w:document xmlns:wpc="http://schemas.microsoft.com/office/word/2010/wordprocessingCanvas" xmlns:cx="http://schemas.microsoft.com/office/drawing/2014/chartex" xmlns:mc="http://schemas.openxmlformats.org/markup-compatibility/2006" xmlns:o="urn:schemas-microsoft-com:office:office" xmlns:r="http://schemas.openxmlformats.org/officeDocument/2006/relationships" xmlns:m="http://schemas.openxmlformats.org/officeDocument/2006/math" xmlns:v="urn:schemas-microsoft-com:vml" xmlns:wp14="http://schemas.microsoft.com/office/word/2010/wordprocessingDrawing" xmlns:wp="http://schemas.openxmlformats.org/drawingml/2006/wordprocessingDrawing" xmlns:w10="urn:schemas-microsoft-com:office:word" xmlns:w="http://schemas.openxmlformats.org/wordprocessingml/2006/main" xmlns:w14="http://schemas.microsoft.com/office/word/2010/wordml" xmlns:w15="http://schemas.microsoft.com/office/word/2012/wordml" xmlns:w16se="http://schemas.microsoft.com/office/word/2015/wordml/symex" xmlns:wpg="http://schemas.microsoft.com/office/word/2010/wordprocessingGroup" xmlns:wpi="http://schemas.microsoft.com/office/word/2010/wordprocessingInk" xmlns:wne="http://schemas.microsoft.com/office/word/2006/wordml" xmlns:wps="http://schemas.microsoft.com/office/word/2010/wordprocessingShape" mc:Ignorable="w14 w15 w16se wp14">
   <w:body>
     <w:p>
+      <w:pPr>
+        <w:rPr>
+          <w:rFonts w:ascii="Arial" w:hAnsi="Arial" w:cs="Arial"/>
+          <w:b/>
+          <w:color w:val="C00000"/>
+          <w:sz w:val="36"/>
+        </w:rPr>
+      </w:pPr>
+      <w:r>
+        <w:rPr>
+          <w:noProof/>
+          <w:lang w:eastAsia="es-MX"/>
+        </w:rPr>
+        <mc:AlternateContent>
+          <mc:Choice Requires="wps">
+            <w:drawing>
+              <wp:anchor distT="45720" distB="45720" distL="114300" distR="114300" simplePos="0" relativeHeight="251674624" behindDoc="0" locked="0" layoutInCell="1" allowOverlap="1" wp14:anchorId="18DB534D" wp14:editId="31177C21">
+                <wp:simplePos x="0" y="0"/>
+                <wp:positionH relativeFrom="margin">
+                  <wp:align>center</wp:align>
+                </wp:positionH>
+                <wp:positionV relativeFrom="paragraph">
+                  <wp:posOffset>8228965</wp:posOffset>
+                </wp:positionV>
+                <wp:extent cx="3093720" cy="411480"/>
+                <wp:effectExtent l="0" t="0" r="0" b="0"/>
+                <wp:wrapNone/>
+                <wp:docPr id="2" name="Cuadro de texto 2"/>
+                <wp:cNvGraphicFramePr>
+                  <a:graphicFrameLocks xmlns:a="http://schemas.openxmlformats.org/drawingml/2006/main"/>
+                </wp:cNvGraphicFramePr>
+                <a:graphic xmlns:a="http://schemas.openxmlformats.org/drawingml/2006/main">
+                  <a:graphicData uri="http://schemas.microsoft.com/office/word/2010/wordprocessingShape">
+                    <wps:wsp>
+                      <wps:cNvSpPr txBox="1">
+                        <a:spLocks noChangeArrowheads="1"/>
+                      </wps:cNvSpPr>
+                      <wps:spPr bwMode="auto">
+                        <a:xfrm>
+                          <a:off x="0" y="0"/>
+                          <a:ext cx="3093720" cy="411480"/>
+                        </a:xfrm>
+                        <a:prstGeom prst="rect">
+                          <a:avLst/>
+                        </a:prstGeom>
+                        <a:noFill/>
+                        <a:ln w="9525">
+                          <a:noFill/>
+                          <a:miter lim="800000"/>
+                          <a:headEnd/>
+                          <a:tailEnd/>
+                        </a:ln>
+                      </wps:spPr>
+                      <wps:txbx>
+                        <w:txbxContent>
+                          <w:p>
+                            <w:pPr>
+                              <w:rPr>
+                                <w:rFonts w:ascii="Bahnschrift Light" w:hAnsi="Bahnschrift Light" w:cs="Arial"/>
+                                <w:sz w:val="36"/>
+                                <w:szCs w:val="28"/>
+                              </w:rPr>
+                            </w:pPr>
+                            <w:r>
+                              <w:rPr>
+                                <w:rFonts w:ascii="Bahnschrift Light" w:hAnsi="Bahnschrift Light" w:cs="Arial"/>
+                                <w:b/>
+                                <w:bCs/>
+                                <w:sz w:val="36"/>
+                                <w:szCs w:val="28"/>
+                              </w:rPr>
+                              <w:t>Periodo</w:t>
+                            </w:r>
+                            <w:r>
+                              <w:rPr>
+                                <w:rFonts w:ascii="Bahnschrift Light" w:hAnsi="Bahnschrift Light" w:cs="Arial"/>
+                                <w:sz w:val="36"/>
+                                <w:szCs w:val="28"/>
+                              </w:rPr>
+                              <w:t xml:space="preserve"> Enero – </w:t>
+                            </w:r>
+                            <w:proofErr w:type="gramStart"/>
+                            <w:r>
+                              <w:rPr>
+                                <w:rFonts w:ascii="Bahnschrift Light" w:hAnsi="Bahnschrift Light" w:cs="Arial"/>
+                                <w:sz w:val="36"/>
+                                <w:szCs w:val="28"/>
+                              </w:rPr>
+                              <w:t>Junio</w:t>
+                            </w:r>
+                            <w:proofErr w:type="gramEnd"/>
+                            <w:r>
+                              <w:rPr>
+                                <w:rFonts w:ascii="Bahnschrift Light" w:hAnsi="Bahnschrift Light" w:cs="Arial"/>
+                                <w:sz w:val="36"/>
+                                <w:szCs w:val="28"/>
+                              </w:rPr>
+                              <w:t xml:space="preserve"> 2026</w:t>
+                            </w:r>
+                          </w:p>
+                        </w:txbxContent>
+                      </wps:txbx>
+                      <wps:bodyPr rot="0" vert="horz" wrap="square" lIns="91440" tIns="45720" rIns="91440" bIns="45720" anchor="t" anchorCtr="0">
+                        <a:noAutofit/>
+                      </wps:bodyPr>
+                    </wps:wsp>
+                  </a:graphicData>
+                </a:graphic>
+                <wp14:sizeRelH relativeFrom="margin">
+                  <wp14:pctWidth>0</wp14:pctWidth>
+                </wp14:sizeRelH>
+                <wp14:sizeRelV relativeFrom="margin">
+                  <wp14:pctHeight>0</wp14:pctHeight>
+                </wp14:sizeRelV>
+              </wp:anchor>
+            </w:drawing>
+          </mc:Choice>
+          <mc:Fallback>
+            <w:pict>
+              <v:shapetype w14:anchorId="18DB534D" id="_x0000_t202" coordsize="21600,21600" o:spt="202" path="m,l,21600r21600,l21600,xe">
+                <v:stroke joinstyle="miter"/>
+                <v:path gradientshapeok="t" o:connecttype="rect"/>
+              </v:shapetype>
+              <v:shape id="Cuadro de texto 2" o:spid="_x0000_s1026" type="#_x0000_t202" style="position:absolute;margin-left:0;margin-top:647.95pt;width:243.6pt;height:32.4pt;z-index:251674624;visibility:visible;mso-wrap-style:square;mso-width-percent:0;mso-height-percent:0;mso-wrap-distance-left:9pt;mso-wrap-distance-top:3.6pt;mso-wrap-distance-right:9pt;mso-wrap-distance-bottom:3.6pt;mso-position-horizontal:center;mso-position-horizontal-relative:margin;mso-position-vertical:absolute;mso-position-vertical-relative:text;mso-width-percent:0;mso-height-percent:0;mso-width-relative:margin;mso-height-relative:margin;v-text-anchor:top" o:gfxdata="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" filled="f" stroked="f">
+                <v:textbox>
+                  <w:txbxContent>
+                    <w:p>
+                      <w:pPr>
+                        <w:rPr>
+                          <w:rFonts w:ascii="Bahnschrift Light" w:hAnsi="Bahnschrift Light" w:cs="Arial"/>
+                          <w:sz w:val="36"/>
+                          <w:szCs w:val="28"/>
+                        </w:rPr>
+                      </w:pPr>
+                      <w:r>
+                        <w:rPr>
+                          <w:rFonts w:ascii="Bahnschrift Light" w:hAnsi="Bahnschrift Light" w:cs="Arial"/>
+                          <w:b/>
+                          <w:bCs/>
+                          <w:sz w:val="36"/>
+                          <w:szCs w:val="28"/>
+                        </w:rPr>
+                        <w:t>Periodo</w:t>
+                      </w:r>
+                      <w:r>
+                        <w:rPr>
+                          <w:rFonts w:ascii="Bahnschrift Light" w:hAnsi="Bahnschrift Light" w:cs="Arial"/>
+                          <w:sz w:val="36"/>
+                          <w:szCs w:val="28"/>
+                        </w:rPr>
+                        <w:t xml:space="preserve"> Enero – </w:t>
+                      </w:r>
+                      <w:proofErr w:type="gramStart"/>
+                      <w:r>
+                        <w:rPr>
+                          <w:rFonts w:ascii="Bahnschrift Light" w:hAnsi="Bahnschrift Light" w:cs="Arial"/>
+                          <w:sz w:val="36"/>
+                          <w:szCs w:val="28"/>
+                        </w:rPr>
+                        <w:t>Junio</w:t>
+                      </w:r>
+                      <w:proofErr w:type="gramEnd"/>
+                      <w:r>
+                        <w:rPr>
+                          <w:rFonts w:ascii="Bahnschrift Light" w:hAnsi="Bahnschrift Light" w:cs="Arial"/>
+                          <w:sz w:val="36"/>
+                          <w:szCs w:val="28"/>
+                        </w:rPr>
+                        <w:t xml:space="preserve"> 2026</w:t>
+                      </w:r>
+                    </w:p>
+                  </w:txbxContent>
+                </v:textbox>
+                <w10:wrap anchorx="margin"/>
+              </v:shape>
+            </w:pict>
+          </mc:Fallback>
+        </mc:AlternateContent>
+      </w:r>
+      <w:r>
+        <w:rPr>
+          <w:noProof/>
+          <w:lang w:eastAsia="es-MX"/>
+        </w:rPr>
+        <mc:AlternateContent>
+          <mc:Choice Requires="wps">
+            <w:drawing>
+              <wp:anchor distT="45720" distB="45720" distL="114300" distR="114300" simplePos="0" relativeHeight="251664384" behindDoc="0" locked="0" layoutInCell="1" allowOverlap="1" wp14:anchorId="6D01B894" wp14:editId="7613079D">
+                <wp:simplePos x="0" y="0"/>
+                <wp:positionH relativeFrom="page">
+                  <wp:posOffset>3054350</wp:posOffset>
+                </wp:positionH>
+                <wp:positionV relativeFrom="paragraph">
+                  <wp:posOffset>3249386</wp:posOffset>
+                </wp:positionV>
+                <wp:extent cx="4188460" cy="474980"/>
+                <wp:effectExtent l="0" t="0" r="0" b="1270"/>
+                <wp:wrapSquare wrapText="bothSides"/>
+                <wp:docPr id="16" name="Cuadro de texto 2"/>
+                <wp:cNvGraphicFramePr>
+                  <a:graphicFrameLocks xmlns:a="http://schemas.openxmlformats.org/drawingml/2006/main"/>
+                </wp:cNvGraphicFramePr>
+                <a:graphic xmlns:a="http://schemas.openxmlformats.org/drawingml/2006/main">
+                  <a:graphicData uri="http://schemas.microsoft.com/office/word/2010/wordprocessingShape">
+                    <wps:wsp>
+                      <wps:cNvSpPr txBox="1">
+                        <a:spLocks noChangeArrowheads="1"/>
+                      </wps:cNvSpPr>
+                      <wps:spPr bwMode="auto">
+                        <a:xfrm>
+                          <a:off x="0" y="0"/>
+                          <a:ext cx="4188460" cy="474980"/>
+                        </a:xfrm>
+                        <a:prstGeom prst="rect">
+                          <a:avLst/>
+                        </a:prstGeom>
+                        <a:noFill/>
+                        <a:ln w="9525">
+                          <a:noFill/>
+                          <a:miter lim="800000"/>
+                          <a:headEnd/>
+                          <a:tailEnd/>
+                        </a:ln>
+                      </wps:spPr>
+                      <wps:txbx>
+                        <w:txbxContent>
+                          <w:p>
+                            <w:pPr>
+                              <w:rPr>
+                                <w:rFonts w:ascii="Arial" w:hAnsi="Arial" w:cs="Arial"/>
+                                <w:sz w:val="40"/>
+                                <w:szCs w:val="36"/>
+                              </w:rPr>
+                            </w:pPr>
+                            <w:r>
+                              <w:rPr>
+                                <w:rFonts w:ascii="Arial" w:hAnsi="Arial" w:cs="Arial"/>
+                                <w:sz w:val="40"/>
+                                <w:szCs w:val="36"/>
+                              </w:rPr>
+                              <w:t xml:space="preserve">Ranfery </w:t>
+                            </w:r>
+                            <w:proofErr w:type="spellStart"/>
+                            <w:r>
+                              <w:rPr>
+                                <w:rFonts w:ascii="Arial" w:hAnsi="Arial" w:cs="Arial"/>
+                                <w:sz w:val="40"/>
+                                <w:szCs w:val="36"/>
+                              </w:rPr>
+                              <w:t>Josua</w:t>
+                            </w:r>
+                            <w:proofErr w:type="spellEnd"/>
+                            <w:r>
+                              <w:rPr>
+                                <w:rFonts w:ascii="Arial" w:hAnsi="Arial" w:cs="Arial"/>
+                                <w:sz w:val="40"/>
+                                <w:szCs w:val="36"/>
+                              </w:rPr>
+                              <w:t xml:space="preserve"> Peregrina Morales</w:t>
+                            </w:r>
+                          </w:p>
+                        </w:txbxContent>
+                      </wps:txbx>
+                      <wps:bodyPr rot="0" vert="horz" wrap="square" lIns="91440" tIns="45720" rIns="91440" bIns="45720" anchor="t" anchorCtr="0">
+                        <a:noAutofit/>
+                      </wps:bodyPr>
+                    </wps:wsp>
+                  </a:graphicData>
+                </a:graphic>
+                <wp14:sizeRelH relativeFrom="margin">
+                  <wp14:pctWidth>0</wp14:pctWidth>
+                </wp14:sizeRelH>
+                <wp14:sizeRelV relativeFrom="margin">
+                  <wp14:pctHeight>0</wp14:pctHeight>
+                </wp14:sizeRelV>
+              </wp:anchor>
+            </w:drawing>
+          </mc:Choice>
+          <mc:Fallback>
+            <w:pict>
+              <v:shape w14:anchorId="6D01B894" id="_x0000_s1027" type="#_x0000_t202" style="position:absolute;margin-left:240.5pt;margin-top:255.85pt;width:329.8pt;height:37.4pt;z-index:251664384;visibility:visible;mso-wrap-style:square;mso-width-percent:0;mso-height-percent:0;mso-wrap-distance-left:9pt;mso-wrap-distance-top:3.6pt;mso-wrap-distance-right:9pt;mso-wrap-distance-bottom:3.6pt;mso-position-horizontal:absolute;mso-position-horizontal-relative:page;mso-position-vertical:absolute;mso-position-vertical-relative:text;mso-width-percent:0;mso-height-percent:0;mso-width-relative:margin;mso-height-relative:margin;v-text-anchor:top" o:gfxdata="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" filled="f" stroked="f">
+                <v:textbox>
+                  <w:txbxContent>
+                    <w:p>
+                      <w:pPr>
+                        <w:rPr>
+                          <w:rFonts w:ascii="Arial" w:hAnsi="Arial" w:cs="Arial"/>
+                          <w:sz w:val="40"/>
+                          <w:szCs w:val="36"/>
+                        </w:rPr>
+                      </w:pPr>
+                      <w:r>
+                        <w:rPr>
+                          <w:rFonts w:ascii="Arial" w:hAnsi="Arial" w:cs="Arial"/>
+                          <w:sz w:val="40"/>
+                          <w:szCs w:val="36"/>
+                        </w:rPr>
+                        <w:t xml:space="preserve">Ranfery </w:t>
+                      </w:r>
+                      <w:proofErr w:type="spellStart"/>
+                      <w:r>
+                        <w:rPr>
+                          <w:rFonts w:ascii="Arial" w:hAnsi="Arial" w:cs="Arial"/>
+                          <w:sz w:val="40"/>
+                          <w:szCs w:val="36"/>
+                        </w:rPr>
+                        <w:t>Josua</w:t>
+                      </w:r>
+                      <w:proofErr w:type="spellEnd"/>
+                      <w:r>
+                        <w:rPr>
+                          <w:rFonts w:ascii="Arial" w:hAnsi="Arial" w:cs="Arial"/>
+                          <w:sz w:val="40"/>
+                          <w:szCs w:val="36"/>
+                        </w:rPr>
+                        <w:t xml:space="preserve"> Peregrina Morales</w:t>
+                      </w:r>
+                    </w:p>
+                  </w:txbxContent>
+                </v:textbox>
+                <w10:wrap type="square" anchorx="page"/>
+              </v:shape>
+            </w:pict>
+          </mc:Fallback>
+        </mc:AlternateContent>
+      </w:r>
+      <w:r>
+        <w:rPr>
+          <w:noProof/>
+          <w:lang w:eastAsia="es-MX"/>
+        </w:rPr>
+        <mc:AlternateContent>
+          <mc:Choice Requires="wps">
+            <w:drawing>
+              <wp:anchor distT="45720" distB="45720" distL="114300" distR="114300" simplePos="0" relativeHeight="251665408" behindDoc="0" locked="0" layoutInCell="1" allowOverlap="1" wp14:anchorId="531809FF" wp14:editId="5C444E22">
+                <wp:simplePos x="0" y="0"/>
+                <wp:positionH relativeFrom="margin">
+                  <wp:posOffset>1956435</wp:posOffset>
+                </wp:positionH>
+                <wp:positionV relativeFrom="paragraph">
+                  <wp:posOffset>3911691</wp:posOffset>
+                </wp:positionV>
+                <wp:extent cx="3959860" cy="391795"/>
+                <wp:effectExtent l="0" t="0" r="0" b="0"/>
+                <wp:wrapSquare wrapText="bothSides"/>
+                <wp:docPr id="17" name="Cuadro de texto 2"/>
+                <wp:cNvGraphicFramePr>
+                  <a:graphicFrameLocks xmlns:a="http://schemas.openxmlformats.org/drawingml/2006/main"/>
+                </wp:cNvGraphicFramePr>
+                <a:graphic xmlns:a="http://schemas.openxmlformats.org/drawingml/2006/main">
+                  <a:graphicData uri="http://schemas.microsoft.com/office/word/2010/wordprocessingShape">
+                    <wps:wsp>
+                      <wps:cNvSpPr txBox="1">
+                        <a:spLocks noChangeArrowheads="1"/>
+                      </wps:cNvSpPr>
+                      <wps:spPr bwMode="auto">
+                        <a:xfrm>
+                          <a:off x="0" y="0"/>
+                          <a:ext cx="3959860" cy="391795"/>
+                        </a:xfrm>
+                        <a:prstGeom prst="rect">
+                          <a:avLst/>
+                        </a:prstGeom>
+                        <a:noFill/>
+                        <a:ln w="9525">
+                          <a:noFill/>
+                          <a:miter lim="800000"/>
+                          <a:headEnd/>
+                          <a:tailEnd/>
+                        </a:ln>
+                      </wps:spPr>
+                      <wps:txbx>
+                        <w:txbxContent>
+                          <w:p>
+                            <w:pPr>
+                              <w:rPr>
+                                <w:rFonts w:ascii="Arial" w:hAnsi="Arial" w:cs="Arial"/>
+                                <w:sz w:val="40"/>
+                                <w:szCs w:val="36"/>
+                              </w:rPr>
+                            </w:pPr>
+                            <w:r>
+                              <w:rPr>
+                                <w:rFonts w:ascii="Arial" w:hAnsi="Arial" w:cs="Arial"/>
+                                <w:sz w:val="40"/>
+                                <w:szCs w:val="36"/>
+                              </w:rPr>
+                              <w:t>1924910</w:t>
+                            </w:r>
+                          </w:p>
+                        </w:txbxContent>
+                      </wps:txbx>
+                      <wps:bodyPr rot="0" vert="horz" wrap="square" lIns="91440" tIns="45720" rIns="91440" bIns="45720" anchor="t" anchorCtr="0">
+                        <a:noAutofit/>
+                      </wps:bodyPr>
+                    </wps:wsp>
+                  </a:graphicData>
+                </a:graphic>
+                <wp14:sizeRelH relativeFrom="margin">
+                  <wp14:pctWidth>0</wp14:pctWidth>
+                </wp14:sizeRelH>
+                <wp14:sizeRelV relativeFrom="margin">
+                  <wp14:pctHeight>0</wp14:pctHeight>
+                </wp14:sizeRelV>
+              </wp:anchor>
+            </w:drawing>
+          </mc:Choice>
+          <mc:Fallback>
+            <w:pict>
+              <v:shape w14:anchorId="531809FF" id="_x0000_s1028" type="#_x0000_t202" style="position:absolute;margin-left:154.05pt;margin-top:308pt;width:311.8pt;height:30.85pt;z-index:251665408;visibility:visible;mso-wrap-style:square;mso-width-percent:0;mso-height-percent:0;mso-wrap-distance-left:9pt;mso-wrap-distance-top:3.6pt;mso-wrap-distance-right:9pt;mso-wrap-distance-bottom:3.6pt;mso-position-horizontal:absolute;mso-position-horizontal-relative:margin;mso-position-vertical:absolute;mso-position-vertical-relative:text;mso-width-percent:0;mso-height-percent:0;mso-width-relative:margin;mso-height-relative:margin;v-text-anchor:top" o:gfxdata="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" filled="f" stroked="f">
+                <v:textbox>
+                  <w:txbxContent>
+                    <w:p>
+                      <w:pPr>
+                        <w:rPr>
+                          <w:rFonts w:ascii="Arial" w:hAnsi="Arial" w:cs="Arial"/>
+                          <w:sz w:val="40"/>
+                          <w:szCs w:val="36"/>
+                        </w:rPr>
+                      </w:pPr>
+                      <w:r>
+                        <w:rPr>
+                          <w:rFonts w:ascii="Arial" w:hAnsi="Arial" w:cs="Arial"/>
+                          <w:sz w:val="40"/>
+                          <w:szCs w:val="36"/>
+                        </w:rPr>
+                        <w:t>1924910</w:t>
+                      </w:r>
+                    </w:p>
+                  </w:txbxContent>
+                </v:textbox>
+                <w10:wrap type="square" anchorx="margin"/>
+              </v:shape>
+            </w:pict>
+          </mc:Fallback>
+        </mc:AlternateContent>
+      </w:r>
+      <w:r>
+        <w:rPr>
+          <w:noProof/>
+          <w:lang w:eastAsia="es-MX"/>
+        </w:rPr>
+        <mc:AlternateContent>
+          <mc:Choice Requires="wps">
+            <w:drawing>
+              <wp:anchor distT="45720" distB="45720" distL="114300" distR="114300" simplePos="0" relativeHeight="251666432" behindDoc="0" locked="0" layoutInCell="1" allowOverlap="1" wp14:anchorId="437647AB" wp14:editId="2BA83261">
+                <wp:simplePos x="0" y="0"/>
+                <wp:positionH relativeFrom="column">
+                  <wp:posOffset>1961333</wp:posOffset>
+                </wp:positionH>
+                <wp:positionV relativeFrom="paragraph">
+                  <wp:posOffset>4605655</wp:posOffset>
+                </wp:positionV>
+                <wp:extent cx="3959860" cy="575310"/>
+                <wp:effectExtent l="0" t="0" r="0" b="0"/>
+                <wp:wrapSquare wrapText="bothSides"/>
+                <wp:docPr id="18" name="Cuadro de texto 2"/>
+                <wp:cNvGraphicFramePr>
+                  <a:graphicFrameLocks xmlns:a="http://schemas.openxmlformats.org/drawingml/2006/main"/>
+                </wp:cNvGraphicFramePr>
+                <a:graphic xmlns:a="http://schemas.openxmlformats.org/drawingml/2006/main">
+                  <a:graphicData uri="http://schemas.microsoft.com/office/word/2010/wordprocessingShape">
+                    <wps:wsp>
+                      <wps:cNvSpPr txBox="1">
+                        <a:spLocks noChangeArrowheads="1"/>
+                      </wps:cNvSpPr>
+                      <wps:spPr bwMode="auto">
+                        <a:xfrm>
+                          <a:off x="0" y="0"/>
+                          <a:ext cx="3959860" cy="575310"/>
+                        </a:xfrm>
+                        <a:prstGeom prst="rect">
+                          <a:avLst/>
+                        </a:prstGeom>
+                        <a:noFill/>
+                        <a:ln w="9525">
+                          <a:noFill/>
+                          <a:miter lim="800000"/>
+                          <a:headEnd/>
+                          <a:tailEnd/>
+                        </a:ln>
+                      </wps:spPr>
+                      <wps:txbx>
+                        <w:txbxContent>
+                          <w:p>
+                            <w:pPr>
+                              <w:rPr>
+                                <w:rFonts w:ascii="Arial" w:hAnsi="Arial" w:cs="Arial"/>
+                                <w:sz w:val="40"/>
+                                <w:szCs w:val="36"/>
+                              </w:rPr>
+                            </w:pPr>
+                            <w:r>
+                              <w:rPr>
+                                <w:rFonts w:ascii="Arial" w:hAnsi="Arial" w:cs="Arial"/>
+                                <w:sz w:val="40"/>
+                                <w:szCs w:val="36"/>
+                              </w:rPr>
+                              <w:t>036</w:t>
+                            </w:r>
+                          </w:p>
+                        </w:txbxContent>
+                      </wps:txbx>
+                      <wps:bodyPr rot="0" vert="horz" wrap="square" lIns="91440" tIns="45720" rIns="91440" bIns="45720" anchor="t" anchorCtr="0">
+                        <a:noAutofit/>
+                      </wps:bodyPr>
+                    </wps:wsp>
+                  </a:graphicData>
+                </a:graphic>
+                <wp14:sizeRelH relativeFrom="margin">
+                  <wp14:pctWidth>0</wp14:pctWidth>
+                </wp14:sizeRelH>
+                <wp14:sizeRelV relativeFrom="margin">
+                  <wp14:pctHeight>0</wp14:pctHeight>
+                </wp14:sizeRelV>
+              </wp:anchor>
+            </w:drawing>
+          </mc:Choice>
+          <mc:Fallback>
+            <w:pict>
+              <v:shape w14:anchorId="437647AB" id="_x0000_s1029" type="#_x0000_t202" style="position:absolute;margin-left:154.45pt;margin-top:362.65pt;width:311.8pt;height:45.3pt;z-index:251666432;visibility:visible;mso-wrap-style:square;mso-width-percent:0;mso-height-percent:0;mso-wrap-distance-left:9pt;mso-wrap-distance-top:3.6pt;mso-wrap-distance-right:9pt;mso-wrap-distance-bottom:3.6pt;mso-position-horizontal:absolute;mso-position-horizontal-relative:text;mso-position-vertical:absolute;mso-position-vertical-relative:text;mso-width-percent:0;mso-height-percent:0;mso-width-relative:margin;mso-height-relative:margin;v-text-anchor:top" o:gfxdata="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" filled="f" stroked="f">
+                <v:textbox>
+                  <w:txbxContent>
+                    <w:p>
+                      <w:pPr>
+                        <w:rPr>
+                          <w:rFonts w:ascii="Arial" w:hAnsi="Arial" w:cs="Arial"/>
+                          <w:sz w:val="40"/>
+                          <w:szCs w:val="36"/>
+                        </w:rPr>
+                      </w:pPr>
+                      <w:r>
+                        <w:rPr>
+                          <w:rFonts w:ascii="Arial" w:hAnsi="Arial" w:cs="Arial"/>
+                          <w:sz w:val="40"/>
+                          <w:szCs w:val="36"/>
+                        </w:rPr>
+                        <w:t>036</w:t>
+                      </w:r>
+                    </w:p>
+                  </w:txbxContent>
+                </v:textbox>
+                <w10:wrap type="square"/>
+              </v:shape>
+            </w:pict>
+          </mc:Fallback>
+        </mc:AlternateContent>
+      </w:r>
+      <w:r>
+        <w:rPr>
+          <w:noProof/>
+          <w:lang w:eastAsia="es-MX"/>
+        </w:rPr>
+        <mc:AlternateContent>
+          <mc:Choice Requires="wps">
+            <w:drawing>
+              <wp:anchor distT="45720" distB="45720" distL="114300" distR="114300" simplePos="0" relativeHeight="251660288" behindDoc="0" locked="0" layoutInCell="1" allowOverlap="1" wp14:anchorId="6EA1831C" wp14:editId="452FBB23">
+                <wp:simplePos x="0" y="0"/>
+                <wp:positionH relativeFrom="margin">
+                  <wp:align>left</wp:align>
+                </wp:positionH>
+                <wp:positionV relativeFrom="paragraph">
+                  <wp:posOffset>3123111</wp:posOffset>
+                </wp:positionV>
+                <wp:extent cx="2124000" cy="575310"/>
+                <wp:effectExtent l="0" t="0" r="0" b="0"/>
+                <wp:wrapSquare wrapText="bothSides"/>
+                <wp:docPr id="6" name="Cuadro de texto 2"/>
+                <wp:cNvGraphicFramePr>
+                  <a:graphicFrameLocks xmlns:a="http://schemas.openxmlformats.org/drawingml/2006/main"/>
+                </wp:cNvGraphicFramePr>
+                <a:graphic xmlns:a="http://schemas.openxmlformats.org/drawingml/2006/main">
+                  <a:graphicData uri="http://schemas.microsoft.com/office/word/2010/wordprocessingShape">
+                    <wps:wsp>
+                      <wps:cNvSpPr txBox="1">
+                        <a:spLocks noChangeArrowheads="1"/>
+                      </wps:cNvSpPr>
+                      <wps:spPr bwMode="auto">
+                        <a:xfrm>
+                          <a:off x="0" y="0"/>
+                          <a:ext cx="2124000" cy="575310"/>
+                        </a:xfrm>
+                        <a:prstGeom prst="rect">
+                          <a:avLst/>
+                        </a:prstGeom>
+                        <a:noFill/>
+                        <a:ln w="9525">
+                          <a:noFill/>
+                          <a:miter lim="800000"/>
+                          <a:headEnd/>
+                          <a:tailEnd/>
+                        </a:ln>
+                      </wps:spPr>
+                      <wps:txbx>
+                        <w:txbxContent>
+                          <w:p>
+                            <w:pPr>
+                              <w:rPr>
+                                <w:rFonts w:ascii="Delight Candles" w:hAnsi="Delight Candles"/>
+                                <w:b/>
+                                <w:color w:val="385623" w:themeColor="accent6" w:themeShade="80"/>
+                                <w:sz w:val="32"/>
+                              </w:rPr>
+                            </w:pPr>
+                            <w:r>
+                              <w:rPr>
+                                <w:rFonts w:ascii="Delight Candles" w:hAnsi="Delight Candles"/>
+                                <w:b/>
+                                <w:color w:val="385623" w:themeColor="accent6" w:themeShade="80"/>
+                                <w:sz w:val="44"/>
+                              </w:rPr>
+                              <w:t>Nombre</w:t>
+                            </w:r>
+                          </w:p>
+                        </w:txbxContent>
+                      </wps:txbx>
+                      <wps:bodyPr rot="0" vert="horz" wrap="square" lIns="91440" tIns="45720" rIns="91440" bIns="45720" anchor="t" anchorCtr="0">
+                        <a:noAutofit/>
+                      </wps:bodyPr>
+                    </wps:wsp>
+                  </a:graphicData>
+                </a:graphic>
+                <wp14:sizeRelH relativeFrom="margin">
+                  <wp14:pctWidth>0</wp14:pctWidth>
+                </wp14:sizeRelH>
+                <wp14:sizeRelV relativeFrom="margin">
+                  <wp14:pctHeight>0</wp14:pctHeight>
+                </wp14:sizeRelV>
+              </wp:anchor>
+            </w:drawing>
+          </mc:Choice>
+          <mc:Fallback>
+            <w:pict>
+              <v:shape w14:anchorId="6EA1831C" id="_x0000_s1030" type="#_x0000_t202" style="position:absolute;margin-left:0;margin-top:245.9pt;width:167.25pt;height:45.3pt;z-index:251660288;visibility:visible;mso-wrap-style:square;mso-width-percent:0;mso-height-percent:0;mso-wrap-distance-left:9pt;mso-wrap-distance-top:3.6pt;mso-wrap-distance-right:9pt;mso-wrap-distance-bottom:3.6pt;mso-position-horizontal:left;mso-position-horizontal-relative:margin;mso-position-vertical:absolute;mso-position-vertical-relative:text;mso-width-percent:0;mso-height-percent:0;mso-width-relative:margin;mso-height-relative:margin;v-text-anchor:top" o:gfxdata="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" filled="f" stroked="f">
+                <v:textbox>
+                  <w:txbxContent>
+                    <w:p>
+                      <w:pPr>
+                        <w:rPr>
+                          <w:rFonts w:ascii="Delight Candles" w:hAnsi="Delight Candles"/>
+                          <w:b/>
+                          <w:color w:val="385623" w:themeColor="accent6" w:themeShade="80"/>
+                          <w:sz w:val="32"/>
+                        </w:rPr>
+                      </w:pPr>
+                      <w:r>
+                        <w:rPr>
+                          <w:rFonts w:ascii="Delight Candles" w:hAnsi="Delight Candles"/>
+                          <w:b/>
+                          <w:color w:val="385623" w:themeColor="accent6" w:themeShade="80"/>
+                          <w:sz w:val="44"/>
+                        </w:rPr>
+                        <w:t>Nombre</w:t>
+                      </w:r>
+                    </w:p>
+                  </w:txbxContent>
+                </v:textbox>
+                <w10:wrap type="square" anchorx="margin"/>
+              </v:shape>
+            </w:pict>
+          </mc:Fallback>
+        </mc:AlternateContent>
+      </w:r>
+      <w:r>
+        <w:rPr>
+          <w:noProof/>
+          <w:lang w:eastAsia="es-MX"/>
+        </w:rPr>
+        <mc:AlternateContent>
+          <mc:Choice Requires="wps">
+            <w:drawing>
+              <wp:anchor distT="45720" distB="45720" distL="114300" distR="114300" simplePos="0" relativeHeight="251661312" behindDoc="0" locked="0" layoutInCell="1" allowOverlap="1" wp14:anchorId="532B1231" wp14:editId="3665D1E5">
+                <wp:simplePos x="0" y="0"/>
+                <wp:positionH relativeFrom="margin">
+                  <wp:align>left</wp:align>
+                </wp:positionH>
+                <wp:positionV relativeFrom="paragraph">
+                  <wp:posOffset>3791585</wp:posOffset>
+                </wp:positionV>
+                <wp:extent cx="2116455" cy="575310"/>
+                <wp:effectExtent l="0" t="0" r="0" b="0"/>
+                <wp:wrapSquare wrapText="bothSides"/>
+                <wp:docPr id="11" name="Cuadro de texto 2"/>
+                <wp:cNvGraphicFramePr>
+                  <a:graphicFrameLocks xmlns:a="http://schemas.openxmlformats.org/drawingml/2006/main"/>
+                </wp:cNvGraphicFramePr>
+                <a:graphic xmlns:a="http://schemas.openxmlformats.org/drawingml/2006/main">
+                  <a:graphicData uri="http://schemas.microsoft.com/office/word/2010/wordprocessingShape">
+                    <wps:wsp>
+                      <wps:cNvSpPr txBox="1">
+                        <a:spLocks noChangeArrowheads="1"/>
+                      </wps:cNvSpPr>
+                      <wps:spPr bwMode="auto">
+                        <a:xfrm>
+                          <a:off x="0" y="0"/>
+                          <a:ext cx="2116455" cy="575310"/>
+                        </a:xfrm>
+                        <a:prstGeom prst="rect">
+                          <a:avLst/>
+                        </a:prstGeom>
+                        <a:noFill/>
+                        <a:ln w="9525">
+                          <a:noFill/>
+                          <a:miter lim="800000"/>
+                          <a:headEnd/>
+                          <a:tailEnd/>
+                        </a:ln>
+                      </wps:spPr>
+                      <wps:txbx>
+                        <w:txbxContent>
+                          <w:p>
+                            <w:pPr>
+                              <w:rPr>
+                                <w:rFonts w:ascii="Delight Candles" w:hAnsi="Delight Candles"/>
+                                <w:b/>
+                                <w:color w:val="385623" w:themeColor="accent6" w:themeShade="80"/>
+                                <w:sz w:val="32"/>
+                              </w:rPr>
+                            </w:pPr>
+                            <w:r>
+                              <w:rPr>
+                                <w:rFonts w:ascii="Delight Candles" w:hAnsi="Delight Candles"/>
+                                <w:b/>
+                                <w:color w:val="385623" w:themeColor="accent6" w:themeShade="80"/>
+                                <w:sz w:val="44"/>
+                              </w:rPr>
+                              <w:t>Matrícula</w:t>
+                            </w:r>
+                          </w:p>
+                        </w:txbxContent>
+                      </wps:txbx>
+                      <wps:bodyPr rot="0" vert="horz" wrap="square" lIns="91440" tIns="45720" rIns="91440" bIns="45720" anchor="t" anchorCtr="0">
+                        <a:noAutofit/>
+                      </wps:bodyPr>
+                    </wps:wsp>
+                  </a:graphicData>
+                </a:graphic>
+                <wp14:sizeRelH relativeFrom="margin">
+                  <wp14:pctWidth>0</wp14:pctWidth>
+                </wp14:sizeRelH>
+                <wp14:sizeRelV relativeFrom="margin">
+                  <wp14:pctHeight>0</wp14:pctHeight>
+                </wp14:sizeRelV>
+              </wp:anchor>
+            </w:drawing>
+          </mc:Choice>
+          <mc:Fallback>
+            <w:pict>
+              <v:shape w14:anchorId="532B1231" id="_x0000_s1031" type="#_x0000_t202" style="position:absolute;margin-left:0;margin-top:298.55pt;width:166.65pt;height:45.3pt;z-index:251661312;visibility:visible;mso-wrap-style:square;mso-width-percent:0;mso-height-percent:0;mso-wrap-distance-left:9pt;mso-wrap-distance-top:3.6pt;mso-wrap-distance-right:9pt;mso-wrap-distance-bottom:3.6pt;mso-position-horizontal:left;mso-position-horizontal-relative:margin;mso-position-vertical:absolute;mso-position-vertical-relative:text;mso-width-percent:0;mso-height-percent:0;mso-width-relative:margin;mso-height-relative:margin;v-text-anchor:top" o:gfxdata="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" filled="f" stroked="f">
+                <v:textbox>
+                  <w:txbxContent>
+                    <w:p>
+                      <w:pPr>
+                        <w:rPr>
+                          <w:rFonts w:ascii="Delight Candles" w:hAnsi="Delight Candles"/>
+                          <w:b/>
+                          <w:color w:val="385623" w:themeColor="accent6" w:themeShade="80"/>
+                          <w:sz w:val="32"/>
+                        </w:rPr>
+                      </w:pPr>
+                      <w:r>
+                        <w:rPr>
+                          <w:rFonts w:ascii="Delight Candles" w:hAnsi="Delight Candles"/>
+                          <w:b/>
+                          <w:color w:val="385623" w:themeColor="accent6" w:themeShade="80"/>
+                          <w:sz w:val="44"/>
+                        </w:rPr>
+                        <w:t>Matrícula</w:t>
+                      </w:r>
+                    </w:p>
+                  </w:txbxContent>
+                </v:textbox>
+                <w10:wrap type="square" anchorx="margin"/>
+              </v:shape>
+            </w:pict>
+          </mc:Fallback>
+        </mc:AlternateContent>
+      </w:r>
+      <w:r>
+        <w:rPr>
+          <w:noProof/>
+          <w:lang w:eastAsia="es-MX"/>
+        </w:rPr>
+        <mc:AlternateContent>
+          <mc:Choice Requires="wps">
+            <w:drawing>
+              <wp:anchor distT="45720" distB="45720" distL="114300" distR="114300" simplePos="0" relativeHeight="251662336" behindDoc="0" locked="0" layoutInCell="1" allowOverlap="1" wp14:anchorId="7B320DD6" wp14:editId="4A49CE2B">
+                <wp:simplePos x="0" y="0"/>
+                <wp:positionH relativeFrom="margin">
+                  <wp:align>left</wp:align>
+                </wp:positionH>
+                <wp:positionV relativeFrom="paragraph">
+                  <wp:posOffset>4407898</wp:posOffset>
+                </wp:positionV>
+                <wp:extent cx="2116455" cy="575310"/>
+                <wp:effectExtent l="0" t="0" r="0" b="0"/>
+                <wp:wrapSquare wrapText="bothSides"/>
+                <wp:docPr id="12" name="Cuadro de texto 2"/>
+                <wp:cNvGraphicFramePr>
+                  <a:graphicFrameLocks xmlns:a="http://schemas.openxmlformats.org/drawingml/2006/main"/>
+                </wp:cNvGraphicFramePr>
+                <a:graphic xmlns:a="http://schemas.openxmlformats.org/drawingml/2006/main">
+                  <a:graphicData uri="http://schemas.microsoft.com/office/word/2010/wordprocessingShape">
+                    <wps:wsp>
+                      <wps:cNvSpPr txBox="1">
+                        <a:spLocks noChangeArrowheads="1"/>
+                      </wps:cNvSpPr>
+                      <wps:spPr bwMode="auto">
+                        <a:xfrm>
+                          <a:off x="0" y="0"/>
+                          <a:ext cx="2116455" cy="575310"/>
+                        </a:xfrm>
+                        <a:prstGeom prst="rect">
+                          <a:avLst/>
+                        </a:prstGeom>
+                        <a:noFill/>
+                        <a:ln w="9525">
+                          <a:noFill/>
+                          <a:miter lim="800000"/>
+                          <a:headEnd/>
+                          <a:tailEnd/>
+                        </a:ln>
+                      </wps:spPr>
+                      <wps:txbx>
+                        <w:txbxContent>
+                          <w:p>
+                            <w:pPr>
+                              <w:rPr>
+                                <w:rFonts w:ascii="Delight Candles" w:hAnsi="Delight Candles"/>
+                                <w:b/>
+                                <w:color w:val="385623" w:themeColor="accent6" w:themeShade="80"/>
+                                <w:sz w:val="32"/>
+                              </w:rPr>
+                            </w:pPr>
+                            <w:r>
+                              <w:rPr>
+                                <w:rFonts w:ascii="Delight Candles" w:hAnsi="Delight Candles"/>
+                                <w:b/>
+                                <w:color w:val="385623" w:themeColor="accent6" w:themeShade="80"/>
+                                <w:sz w:val="44"/>
+                              </w:rPr>
+                              <w:t>Grupo</w:t>
+                            </w:r>
+                          </w:p>
+                        </w:txbxContent>
+                      </wps:txbx>
+                      <wps:bodyPr rot="0" vert="horz" wrap="square" lIns="91440" tIns="45720" rIns="91440" bIns="45720" anchor="t" anchorCtr="0">
+                        <a:noAutofit/>
+                      </wps:bodyPr>
+                    </wps:wsp>
+                  </a:graphicData>
+                </a:graphic>
+                <wp14:sizeRelH relativeFrom="margin">
+                  <wp14:pctWidth>0</wp14:pctWidth>
+                </wp14:sizeRelH>
+                <wp14:sizeRelV relativeFrom="margin">
+                  <wp14:pctHeight>0</wp14:pctHeight>
+                </wp14:sizeRelV>
+              </wp:anchor>
+            </w:drawing>
+          </mc:Choice>
+          <mc:Fallback>
+            <w:pict>
+              <v:shape w14:anchorId="7B320DD6" id="_x0000_s1032" type="#_x0000_t202" style="position:absolute;margin-left:0;margin-top:347.1pt;width:166.65pt;height:45.3pt;z-index:251662336;visibility:visible;mso-wrap-style:square;mso-width-percent:0;mso-height-percent:0;mso-wrap-distance-left:9pt;mso-wrap-distance-top:3.6pt;mso-wrap-distance-right:9pt;mso-wrap-distance-bottom:3.6pt;mso-position-horizontal:left;mso-position-horizontal-relative:margin;mso-position-vertical:absolute;mso-position-vertical-relative:text;mso-width-percent:0;mso-height-percent:0;mso-width-relative:margin;mso-height-relative:margin;v-text-anchor:top" o:gfxdata="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" filled="f" stroked="f">
+                <v:textbox>
+                  <w:txbxContent>
+                    <w:p>
+                      <w:pPr>
+                        <w:rPr>
+                          <w:rFonts w:ascii="Delight Candles" w:hAnsi="Delight Candles"/>
+                          <w:b/>
+                          <w:color w:val="385623" w:themeColor="accent6" w:themeShade="80"/>
+                          <w:sz w:val="32"/>
+                        </w:rPr>
+                      </w:pPr>
+                      <w:r>
+                        <w:rPr>
+                          <w:rFonts w:ascii="Delight Candles" w:hAnsi="Delight Candles"/>
+                          <w:b/>
+                          <w:color w:val="385623" w:themeColor="accent6" w:themeShade="80"/>
+                          <w:sz w:val="44"/>
+                        </w:rPr>
+                        <w:t>Grupo</w:t>
+                      </w:r>
+                    </w:p>
+                  </w:txbxContent>
+                </v:textbox>
+                <w10:wrap type="square" anchorx="margin"/>
+              </v:shape>
+            </w:pict>
+          </mc:Fallback>
+        </mc:AlternateContent>
+      </w:r>
+      <w:r>
+        <w:rPr>
+          <w:noProof/>
+          <w:lang w:eastAsia="es-MX"/>
+        </w:rPr>
+        <w:drawing>
+          <wp:anchor distT="0" distB="0" distL="114300" distR="114300" simplePos="0" relativeHeight="251659264" behindDoc="1" locked="0" layoutInCell="1" allowOverlap="1" wp14:anchorId="0C77122E" wp14:editId="4F0117EC">
+            <wp:simplePos x="0" y="0"/>
+            <wp:positionH relativeFrom="page">
+              <wp:align>right</wp:align>
+            </wp:positionH>
+            <wp:positionV relativeFrom="page">
+              <wp:align>top</wp:align>
+            </wp:positionV>
+            <wp:extent cx="7772400" cy="10040449"/>
+            <wp:effectExtent l="0" t="0" r="0" b="0"/>
+            <wp:wrapNone/>
+            <wp:docPr id="1841485888" name="Imagen 1"/>
+            <wp:cNvGraphicFramePr>
+              <a:graphicFrameLocks xmlns:a="http://schemas.openxmlformats.org/drawingml/2006/main" noChangeAspect="1"/>
+            </wp:cNvGraphicFramePr>
+            <a:graphic xmlns:a="http://schemas.openxmlformats.org/drawingml/2006/main">
+              <a:graphicData uri="http://schemas.openxmlformats.org/drawingml/2006/picture">
+                <pic:pic xmlns:pic="http://schemas.openxmlformats.org/drawingml/2006/picture">
+                  <pic:nvPicPr>
+                    <pic:cNvPr id="1841485888" name=""/>
+                    <pic:cNvPicPr/>
+                  </pic:nvPicPr>
+                  <pic:blipFill>
+                    <a:blip r:embed="rId4">
+                      <a:extLst>
+                        <a:ext uri="{28A0092B-C50C-407E-A947-70E740481C1C}">
+                          <a14:useLocalDpi xmlns:a14="http://schemas.microsoft.com/office/drawing/2010/main" val="0"/>
+                        </a:ext>
+                      </a:extLst>
+                    </a:blip>
+                    <a:stretch>
+                      <a:fillRect/>
+                    </a:stretch>
+                  </pic:blipFill>
+                  <pic:spPr>
+                    <a:xfrm>
+                      <a:off x="0" y="0"/>
+                      <a:ext cx="7772400" cy="10040449"/>
+                    </a:xfrm>
+                    <a:prstGeom prst="rect">
+                      <a:avLst/>
+                    </a:prstGeom>
+                  </pic:spPr>
+                </pic:pic>
+              </a:graphicData>
+            </a:graphic>
+            <wp14:sizeRelH relativeFrom="margin">
+              <wp14:pctWidth>0</wp14:pctWidth>
+            </wp14:sizeRelH>
+            <wp14:sizeRelV relativeFrom="margin">
+              <wp14:pctHeight>0</wp14:pctHeight>
+            </wp14:sizeRelV>
+          </wp:anchor>
+        </w:drawing>
+      </w:r>
+      <w:r>
+        <w:rPr>
+          <w:noProof/>
+          <w:lang w:eastAsia="es-MX"/>
+        </w:rPr>
+        <mc:AlternateContent>
+          <mc:Choice Requires="wps">
+            <w:drawing>
+              <wp:anchor distT="45720" distB="45720" distL="114300" distR="114300" simplePos="0" relativeHeight="251673600" behindDoc="0" locked="0" layoutInCell="1" allowOverlap="1" wp14:anchorId="77FF8ED3" wp14:editId="2217298B">
+                <wp:simplePos x="0" y="0"/>
+                <wp:positionH relativeFrom="page">
+                  <wp:posOffset>3020060</wp:posOffset>
+                </wp:positionH>
+                <wp:positionV relativeFrom="paragraph">
+                  <wp:posOffset>7180580</wp:posOffset>
+                </wp:positionV>
+                <wp:extent cx="3959860" cy="575310"/>
+                <wp:effectExtent l="0" t="0" r="0" b="0"/>
+                <wp:wrapSquare wrapText="bothSides"/>
+                <wp:docPr id="280973277" name="Cuadro de texto 2"/>
+                <wp:cNvGraphicFramePr>
+                  <a:graphicFrameLocks xmlns:a="http://schemas.openxmlformats.org/drawingml/2006/main"/>
+                </wp:cNvGraphicFramePr>
+                <a:graphic xmlns:a="http://schemas.openxmlformats.org/drawingml/2006/main">
+                  <a:graphicData uri="http://schemas.microsoft.com/office/word/2010/wordprocessingShape">
+                    <wps:wsp>
+                      <wps:cNvSpPr txBox="1">
+                        <a:spLocks noChangeArrowheads="1"/>
+                      </wps:cNvSpPr>
+                      <wps:spPr bwMode="auto">
+                        <a:xfrm>
+                          <a:off x="0" y="0"/>
+                          <a:ext cx="3959860" cy="575310"/>
+                        </a:xfrm>
+                        <a:prstGeom prst="rect">
+                          <a:avLst/>
+                        </a:prstGeom>
+                        <a:noFill/>
+                        <a:ln w="9525">
+                          <a:noFill/>
+                          <a:miter lim="800000"/>
+                          <a:headEnd/>
+                          <a:tailEnd/>
+                        </a:ln>
+                      </wps:spPr>
+                      <wps:txbx>
+                        <w:txbxContent>
+                          <w:p>
+                            <w:pPr>
+                              <w:rPr>
+                                <w:rFonts w:ascii="Arial" w:hAnsi="Arial" w:cs="Arial"/>
+                                <w:sz w:val="40"/>
+                                <w:szCs w:val="36"/>
+                              </w:rPr>
+                            </w:pPr>
+                            <w:r>
+                              <w:rPr>
+                                <w:rFonts w:ascii="Arial" w:hAnsi="Arial" w:cs="Arial"/>
+                                <w:sz w:val="40"/>
+                                <w:szCs w:val="36"/>
+                              </w:rPr>
+                              <w:t>13/02/25</w:t>
+                            </w:r>
+                          </w:p>
+                        </w:txbxContent>
+                      </wps:txbx>
+                      <wps:bodyPr rot="0" vert="horz" wrap="square" lIns="91440" tIns="45720" rIns="91440" bIns="45720" anchor="t" anchorCtr="0">
+                        <a:noAutofit/>
+                      </wps:bodyPr>
+                    </wps:wsp>
+                  </a:graphicData>
+                </a:graphic>
+                <wp14:sizeRelH relativeFrom="margin">
+                  <wp14:pctWidth>0</wp14:pctWidth>
+                </wp14:sizeRelH>
+                <wp14:sizeRelV relativeFrom="margin">
+                  <wp14:pctHeight>0</wp14:pctHeight>
+                </wp14:sizeRelV>
+              </wp:anchor>
+            </w:drawing>
+          </mc:Choice>
+          <mc:Fallback>
+            <w:pict>
+              <v:shape w14:anchorId="77FF8ED3" id="_x0000_s1033" type="#_x0000_t202" style="position:absolute;margin-left:237.8pt;margin-top:565.4pt;width:311.8pt;height:45.3pt;z-index:251673600;visibility:visible;mso-wrap-style:square;mso-width-percent:0;mso-height-percent:0;mso-wrap-distance-left:9pt;mso-wrap-distance-top:3.6pt;mso-wrap-distance-right:9pt;mso-wrap-distance-bottom:3.6pt;mso-position-horizontal:absolute;mso-position-horizontal-relative:page;mso-position-vertical:absolute;mso-position-vertical-relative:text;mso-width-percent:0;mso-height-percent:0;mso-width-relative:margin;mso-height-relative:margin;v-text-anchor:top" o:gfxdata="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" filled="f" stroked="f">
+                <v:textbox>
+                  <w:txbxContent>
+                    <w:p>
+                      <w:pPr>
+                        <w:rPr>
+                          <w:rFonts w:ascii="Arial" w:hAnsi="Arial" w:cs="Arial"/>
+                          <w:sz w:val="40"/>
+                          <w:szCs w:val="36"/>
+                        </w:rPr>
+                      </w:pPr>
+                      <w:r>
+                        <w:rPr>
+                          <w:rFonts w:ascii="Arial" w:hAnsi="Arial" w:cs="Arial"/>
+                          <w:sz w:val="40"/>
+                          <w:szCs w:val="36"/>
+                        </w:rPr>
+                        <w:t>13/02/25</w:t>
+                      </w:r>
+                    </w:p>
+                  </w:txbxContent>
+                </v:textbox>
+                <w10:wrap type="square" anchorx="page"/>
+              </v:shape>
+            </w:pict>
+          </mc:Fallback>
+        </mc:AlternateContent>
+      </w:r>
+      <w:r>
+        <w:rPr>
+          <w:noProof/>
+          <w:lang w:eastAsia="es-MX"/>
+        </w:rPr>
+        <mc:AlternateContent>
+          <mc:Choice Requires="wps">
+            <w:drawing>
+              <wp:anchor distT="45720" distB="45720" distL="114300" distR="114300" simplePos="0" relativeHeight="251672576" behindDoc="0" locked="0" layoutInCell="1" allowOverlap="1" wp14:anchorId="6DA17AC2" wp14:editId="66EF4655">
+                <wp:simplePos x="0" y="0"/>
+                <wp:positionH relativeFrom="page">
+                  <wp:posOffset>3017520</wp:posOffset>
+                </wp:positionH>
+                <wp:positionV relativeFrom="paragraph">
+                  <wp:posOffset>6531610</wp:posOffset>
+                </wp:positionV>
+                <wp:extent cx="4434840" cy="575310"/>
+                <wp:effectExtent l="0" t="0" r="0" b="0"/>
+                <wp:wrapSquare wrapText="bothSides"/>
+                <wp:docPr id="22" name="Cuadro de texto 2"/>
+                <wp:cNvGraphicFramePr>
+                  <a:graphicFrameLocks xmlns:a="http://schemas.openxmlformats.org/drawingml/2006/main"/>
+                </wp:cNvGraphicFramePr>
+                <a:graphic xmlns:a="http://schemas.openxmlformats.org/drawingml/2006/main">
+                  <a:graphicData uri="http://schemas.microsoft.com/office/word/2010/wordprocessingShape">
+                    <wps:wsp>
+                      <wps:cNvSpPr txBox="1">
+                        <a:spLocks noChangeArrowheads="1"/>
+                      </wps:cNvSpPr>
+                      <wps:spPr bwMode="auto">
+                        <a:xfrm>
+                          <a:off x="0" y="0"/>
+                          <a:ext cx="4434840" cy="575310"/>
+                        </a:xfrm>
+                        <a:prstGeom prst="rect">
+                          <a:avLst/>
+                        </a:prstGeom>
+                        <a:noFill/>
+                        <a:ln w="9525">
+                          <a:noFill/>
+                          <a:miter lim="800000"/>
+                          <a:headEnd/>
+                          <a:tailEnd/>
+                        </a:ln>
+                      </wps:spPr>
+                      <wps:txbx>
+                        <w:txbxContent>
+                          <w:p>
+                            <w:pPr>
+                              <w:rPr>
+                                <w:rFonts w:ascii="Arial" w:hAnsi="Arial" w:cs="Arial"/>
+                                <w:sz w:val="40"/>
+                                <w:szCs w:val="36"/>
+                              </w:rPr>
+                            </w:pPr>
+                            <w:r>
+                              <w:rPr>
+                                <w:rFonts w:ascii="Arial" w:hAnsi="Arial" w:cs="Arial"/>
+                                <w:sz w:val="40"/>
+                                <w:szCs w:val="36"/>
+                              </w:rPr>
+                              <w:t xml:space="preserve">Diana Martínez </w:t>
+                            </w:r>
+                            <w:proofErr w:type="spellStart"/>
+                            <w:r>
+                              <w:rPr>
+                                <w:rFonts w:ascii="Arial" w:hAnsi="Arial" w:cs="Arial"/>
+                                <w:sz w:val="40"/>
+                                <w:szCs w:val="36"/>
+                              </w:rPr>
+                              <w:t>Martínez</w:t>
+                            </w:r>
+                            <w:proofErr w:type="spellEnd"/>
+                          </w:p>
+                        </w:txbxContent>
+                      </wps:txbx>
+                      <wps:bodyPr rot="0" vert="horz" wrap="square" lIns="91440" tIns="45720" rIns="91440" bIns="45720" anchor="t" anchorCtr="0">
+                        <a:noAutofit/>
+                      </wps:bodyPr>
+                    </wps:wsp>
+                  </a:graphicData>
+                </a:graphic>
+                <wp14:sizeRelH relativeFrom="margin">
+                  <wp14:pctWidth>0</wp14:pctWidth>
+                </wp14:sizeRelH>
+                <wp14:sizeRelV relativeFrom="margin">
+                  <wp14:pctHeight>0</wp14:pctHeight>
+                </wp14:sizeRelV>
+              </wp:anchor>
+            </w:drawing>
+          </mc:Choice>
+          <mc:Fallback>
+            <w:pict>
+              <v:shape w14:anchorId="6DA17AC2" id="_x0000_s1034" type="#_x0000_t202" style="position:absolute;margin-left:237.6pt;margin-top:514.3pt;width:349.2pt;height:45.3pt;z-index:251672576;visibility:visible;mso-wrap-style:square;mso-width-percent:0;mso-height-percent:0;mso-wrap-distance-left:9pt;mso-wrap-distance-top:3.6pt;mso-wrap-distance-right:9pt;mso-wrap-distance-bottom:3.6pt;mso-position-horizontal:absolute;mso-position-horizontal-relative:page;mso-position-vertical:absolute;mso-position-vertical-relative:text;mso-width-percent:0;mso-height-percent:0;mso-width-relative:margin;mso-height-relative:margin;v-text-anchor:top" o:gfxdata="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" filled="f" stroked="f">
+                <v:textbox>
+                  <w:txbxContent>
+                    <w:p>
+                      <w:pPr>
+                        <w:rPr>
+                          <w:rFonts w:ascii="Arial" w:hAnsi="Arial" w:cs="Arial"/>
+                          <w:sz w:val="40"/>
+                          <w:szCs w:val="36"/>
+                        </w:rPr>
+                      </w:pPr>
+                      <w:r>
+                        <w:rPr>
+                          <w:rFonts w:ascii="Arial" w:hAnsi="Arial" w:cs="Arial"/>
+                          <w:sz w:val="40"/>
+                          <w:szCs w:val="36"/>
+                        </w:rPr>
+                        <w:t xml:space="preserve">Diana Martínez </w:t>
+                      </w:r>
+                      <w:proofErr w:type="spellStart"/>
+                      <w:r>
+                        <w:rPr>
+                          <w:rFonts w:ascii="Arial" w:hAnsi="Arial" w:cs="Arial"/>
+                          <w:sz w:val="40"/>
+                          <w:szCs w:val="36"/>
+                        </w:rPr>
+                        <w:t>Martínez</w:t>
+                      </w:r>
+                      <w:proofErr w:type="spellEnd"/>
+                    </w:p>
+                  </w:txbxContent>
+                </v:textbox>
+                <w10:wrap type="square" anchorx="page"/>
+              </v:shape>
+            </w:pict>
+          </mc:Fallback>
+        </mc:AlternateContent>
+      </w:r>
+      <w:r>
+        <w:rPr>
+          <w:noProof/>
+          <w:lang w:eastAsia="es-MX"/>
+        </w:rPr>
+        <mc:AlternateContent>
+          <mc:Choice Requires="wps">
+            <w:drawing>
+              <wp:anchor distT="45720" distB="45720" distL="114300" distR="114300" simplePos="0" relativeHeight="251676672" behindDoc="0" locked="0" layoutInCell="1" allowOverlap="1" wp14:anchorId="046A0D6A" wp14:editId="73914983">
+                <wp:simplePos x="0" y="0"/>
+                <wp:positionH relativeFrom="page">
+                  <wp:posOffset>3020060</wp:posOffset>
+                </wp:positionH>
+                <wp:positionV relativeFrom="paragraph">
+                  <wp:posOffset>5165090</wp:posOffset>
+                </wp:positionV>
+                <wp:extent cx="3959860" cy="575310"/>
+                <wp:effectExtent l="0" t="0" r="0" b="0"/>
+                <wp:wrapSquare wrapText="bothSides"/>
+                <wp:docPr id="9" name="Cuadro de texto 2"/>
+                <wp:cNvGraphicFramePr>
+                  <a:graphicFrameLocks xmlns:a="http://schemas.openxmlformats.org/drawingml/2006/main"/>
+                </wp:cNvGraphicFramePr>
+                <a:graphic xmlns:a="http://schemas.openxmlformats.org/drawingml/2006/main">
+                  <a:graphicData uri="http://schemas.microsoft.com/office/word/2010/wordprocessingShape">
+                    <wps:wsp>
+                      <wps:cNvSpPr txBox="1">
+                        <a:spLocks noChangeArrowheads="1"/>
+                      </wps:cNvSpPr>
+                      <wps:spPr bwMode="auto">
+                        <a:xfrm>
+                          <a:off x="0" y="0"/>
+                          <a:ext cx="3959860" cy="575310"/>
+                        </a:xfrm>
+                        <a:prstGeom prst="rect">
+                          <a:avLst/>
+                        </a:prstGeom>
+                        <a:noFill/>
+                        <a:ln w="9525">
+                          <a:noFill/>
+                          <a:miter lim="800000"/>
+                          <a:headEnd/>
+                          <a:tailEnd/>
+                        </a:ln>
+                      </wps:spPr>
+                      <wps:txbx>
+                        <w:txbxContent>
+                          <w:p>
+                            <w:pPr>
+                              <w:rPr>
+                                <w:rFonts w:ascii="Arial" w:hAnsi="Arial" w:cs="Arial"/>
+                                <w:sz w:val="40"/>
+                                <w:szCs w:val="36"/>
+                              </w:rPr>
+                            </w:pPr>
+                            <w:r>
+                              <w:rPr>
+                                <w:rFonts w:ascii="Arial" w:hAnsi="Arial" w:cs="Arial"/>
+                                <w:sz w:val="40"/>
+                                <w:szCs w:val="36"/>
+                              </w:rPr>
+                              <w:t>ITS</w:t>
+                            </w:r>
+                          </w:p>
+                        </w:txbxContent>
+                      </wps:txbx>
+                      <wps:bodyPr rot="0" vert="horz" wrap="square" lIns="91440" tIns="45720" rIns="91440" bIns="45720" anchor="t" anchorCtr="0">
+                        <a:noAutofit/>
+                      </wps:bodyPr>
+                    </wps:wsp>
+                  </a:graphicData>
+                </a:graphic>
+                <wp14:sizeRelH relativeFrom="margin">
+                  <wp14:pctWidth>0</wp14:pctWidth>
+                </wp14:sizeRelH>
+                <wp14:sizeRelV relativeFrom="margin">
+                  <wp14:pctHeight>0</wp14:pctHeight>
+                </wp14:sizeRelV>
+              </wp:anchor>
+            </w:drawing>
+          </mc:Choice>
+          <mc:Fallback>
+            <w:pict>
+              <v:shape w14:anchorId="046A0D6A" id="_x0000_s1035" type="#_x0000_t202" style="position:absolute;margin-left:237.8pt;margin-top:406.7pt;width:311.8pt;height:45.3pt;z-index:251676672;visibility:visible;mso-wrap-style:square;mso-width-percent:0;mso-height-percent:0;mso-wrap-distance-left:9pt;mso-wrap-distance-top:3.6pt;mso-wrap-distance-right:9pt;mso-wrap-distance-bottom:3.6pt;mso-position-horizontal:absolute;mso-position-horizontal-relative:page;mso-position-vertical:absolute;mso-position-vertical-relative:text;mso-width-percent:0;mso-height-percent:0;mso-width-relative:margin;mso-height-relative:margin;v-text-anchor:top" o:gfxdata="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" filled="f" stroked="f">
+                <v:textbox>
+                  <w:txbxContent>
+                    <w:p>
+                      <w:pPr>
+                        <w:rPr>
+                          <w:rFonts w:ascii="Arial" w:hAnsi="Arial" w:cs="Arial"/>
+                          <w:sz w:val="40"/>
+                          <w:szCs w:val="36"/>
+                        </w:rPr>
+                      </w:pPr>
+                      <w:r>
+                        <w:rPr>
+                          <w:rFonts w:ascii="Arial" w:hAnsi="Arial" w:cs="Arial"/>
+                          <w:sz w:val="40"/>
+                          <w:szCs w:val="36"/>
+                        </w:rPr>
+                        <w:t>ITS</w:t>
+                      </w:r>
+                    </w:p>
+                  </w:txbxContent>
+                </v:textbox>
+                <w10:wrap type="square" anchorx="page"/>
+              </v:shape>
+            </w:pict>
+          </mc:Fallback>
+        </mc:AlternateContent>
+      </w:r>
+      <w:r>
+        <w:rPr>
+          <w:noProof/>
+          <w:lang w:eastAsia="es-MX"/>
+        </w:rPr>
+        <mc:AlternateContent>
+          <mc:Choice Requires="wps">
+            <w:drawing>
+              <wp:anchor distT="45720" distB="45720" distL="114300" distR="114300" simplePos="0" relativeHeight="251675648" behindDoc="0" locked="0" layoutInCell="1" allowOverlap="1" wp14:anchorId="27BE14A9" wp14:editId="422B6ACA">
+                <wp:simplePos x="0" y="0"/>
+                <wp:positionH relativeFrom="margin">
+                  <wp:align>left</wp:align>
+                </wp:positionH>
+                <wp:positionV relativeFrom="paragraph">
+                  <wp:posOffset>5043805</wp:posOffset>
+                </wp:positionV>
+                <wp:extent cx="2116455" cy="575310"/>
+                <wp:effectExtent l="0" t="0" r="0" b="0"/>
+                <wp:wrapSquare wrapText="bothSides"/>
+                <wp:docPr id="8" name="Cuadro de texto 2"/>
+                <wp:cNvGraphicFramePr>
+                  <a:graphicFrameLocks xmlns:a="http://schemas.openxmlformats.org/drawingml/2006/main"/>
+                </wp:cNvGraphicFramePr>
+                <a:graphic xmlns:a="http://schemas.openxmlformats.org/drawingml/2006/main">
+                  <a:graphicData uri="http://schemas.microsoft.com/office/word/2010/wordprocessingShape">
+                    <wps:wsp>
+                      <wps:cNvSpPr txBox="1">
+                        <a:spLocks noChangeArrowheads="1"/>
+                      </wps:cNvSpPr>
+                      <wps:spPr bwMode="auto">
+                        <a:xfrm>
+                          <a:off x="0" y="0"/>
+                          <a:ext cx="2116455" cy="575310"/>
+                        </a:xfrm>
+                        <a:prstGeom prst="rect">
+                          <a:avLst/>
+                        </a:prstGeom>
+                        <a:noFill/>
+                        <a:ln w="9525">
+                          <a:noFill/>
+                          <a:miter lim="800000"/>
+                          <a:headEnd/>
+                          <a:tailEnd/>
+                        </a:ln>
+                      </wps:spPr>
+                      <wps:txbx>
+                        <w:txbxContent>
+                          <w:p>
+                            <w:pPr>
+                              <w:rPr>
+                                <w:rFonts w:ascii="Delight Candles" w:hAnsi="Delight Candles"/>
+                                <w:b/>
+                                <w:color w:val="385623" w:themeColor="accent6" w:themeShade="80"/>
+                                <w:sz w:val="32"/>
+                              </w:rPr>
+                            </w:pPr>
+                            <w:r>
+                              <w:rPr>
+                                <w:rFonts w:ascii="Delight Candles" w:hAnsi="Delight Candles"/>
+                                <w:b/>
+                                <w:color w:val="385623" w:themeColor="accent6" w:themeShade="80"/>
+                                <w:sz w:val="44"/>
+                              </w:rPr>
+                              <w:t>Carrera</w:t>
+                            </w:r>
+                          </w:p>
+                        </w:txbxContent>
+                      </wps:txbx>
+                      <wps:bodyPr rot="0" vert="horz" wrap="square" lIns="91440" tIns="45720" rIns="91440" bIns="45720" anchor="t" anchorCtr="0">
+                        <a:noAutofit/>
+                      </wps:bodyPr>
+                    </wps:wsp>
+                  </a:graphicData>
+                </a:graphic>
+                <wp14:sizeRelH relativeFrom="margin">
+                  <wp14:pctWidth>0</wp14:pctWidth>
+                </wp14:sizeRelH>
+                <wp14:sizeRelV relativeFrom="margin">
+                  <wp14:pctHeight>0</wp14:pctHeight>
+                </wp14:sizeRelV>
+              </wp:anchor>
+            </w:drawing>
+          </mc:Choice>
+          <mc:Fallback>
+            <w:pict>
+              <v:shape w14:anchorId="27BE14A9" id="_x0000_s1036" type="#_x0000_t202" style="position:absolute;margin-left:0;margin-top:397.15pt;width:166.65pt;height:45.3pt;z-index:251675648;visibility:visible;mso-wrap-style:square;mso-width-percent:0;mso-height-percent:0;mso-wrap-distance-left:9pt;mso-wrap-distance-top:3.6pt;mso-wrap-distance-right:9pt;mso-wrap-distance-bottom:3.6pt;mso-position-horizontal:left;mso-position-horizontal-relative:margin;mso-position-vertical:absolute;mso-position-vertical-relative:text;mso-width-percent:0;mso-height-percent:0;mso-width-relative:margin;mso-height-relative:margin;v-text-anchor:top" o:gfxdata="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" filled="f" stroked="f">
+                <v:textbox>
+                  <w:txbxContent>
+                    <w:p>
+                      <w:pPr>
+                        <w:rPr>
+                          <w:rFonts w:ascii="Delight Candles" w:hAnsi="Delight Candles"/>
+                          <w:b/>
+                          <w:color w:val="385623" w:themeColor="accent6" w:themeShade="80"/>
+                          <w:sz w:val="32"/>
+                        </w:rPr>
+                      </w:pPr>
+                      <w:r>
+                        <w:rPr>
+                          <w:rFonts w:ascii="Delight Candles" w:hAnsi="Delight Candles"/>
+                          <w:b/>
+                          <w:color w:val="385623" w:themeColor="accent6" w:themeShade="80"/>
+                          <w:sz w:val="44"/>
+                        </w:rPr>
+                        <w:t>Carrera</w:t>
+                      </w:r>
+                    </w:p>
+                  </w:txbxContent>
+                </v:textbox>
+                <w10:wrap type="square" anchorx="margin"/>
+              </v:shape>
+            </w:pict>
+          </mc:Fallback>
+        </mc:AlternateContent>
+      </w:r>
+      <w:r>
+        <w:rPr>
+          <w:noProof/>
+          <w:lang w:eastAsia="es-MX"/>
+        </w:rPr>
+        <mc:AlternateContent>
+          <mc:Choice Requires="wps">
+            <w:drawing>
+              <wp:anchor distT="45720" distB="45720" distL="114300" distR="114300" simplePos="0" relativeHeight="251670528" behindDoc="0" locked="0" layoutInCell="1" allowOverlap="1" wp14:anchorId="16ACA798" wp14:editId="78A62E62">
+                <wp:simplePos x="0" y="0"/>
+                <wp:positionH relativeFrom="margin">
+                  <wp:posOffset>18011</wp:posOffset>
+                </wp:positionH>
+                <wp:positionV relativeFrom="paragraph">
+                  <wp:posOffset>7089486</wp:posOffset>
+                </wp:positionV>
+                <wp:extent cx="1295400" cy="668020"/>
+                <wp:effectExtent l="0" t="0" r="0" b="0"/>
+                <wp:wrapSquare wrapText="bothSides"/>
+                <wp:docPr id="14" name="Cuadro de texto 2"/>
+                <wp:cNvGraphicFramePr>
+                  <a:graphicFrameLocks xmlns:a="http://schemas.openxmlformats.org/drawingml/2006/main"/>
+                </wp:cNvGraphicFramePr>
+                <a:graphic xmlns:a="http://schemas.openxmlformats.org/drawingml/2006/main">
+                  <a:graphicData uri="http://schemas.microsoft.com/office/word/2010/wordprocessingShape">
+                    <wps:wsp>
+                      <wps:cNvSpPr txBox="1">
+                        <a:spLocks noChangeArrowheads="1"/>
+                      </wps:cNvSpPr>
+                      <wps:spPr bwMode="auto">
+                        <a:xfrm>
+                          <a:off x="0" y="0"/>
+                          <a:ext cx="1295400" cy="668020"/>
+                        </a:xfrm>
+                        <a:prstGeom prst="rect">
+                          <a:avLst/>
+                        </a:prstGeom>
+                        <a:noFill/>
+                        <a:ln w="9525">
+                          <a:noFill/>
+                          <a:miter lim="800000"/>
+                          <a:headEnd/>
+                          <a:tailEnd/>
+                        </a:ln>
+                      </wps:spPr>
+                      <wps:txbx>
+                        <w:txbxContent>
+                          <w:p>
+                            <w:pPr>
+                              <w:rPr>
+                                <w:rFonts w:ascii="Delight Candles" w:hAnsi="Delight Candles"/>
+                                <w:b/>
+                                <w:color w:val="385623" w:themeColor="accent6" w:themeShade="80"/>
+                                <w:sz w:val="32"/>
+                              </w:rPr>
+                            </w:pPr>
+                            <w:r>
+                              <w:rPr>
+                                <w:rFonts w:ascii="Delight Candles" w:hAnsi="Delight Candles"/>
+                                <w:b/>
+                                <w:color w:val="385623" w:themeColor="accent6" w:themeShade="80"/>
+                                <w:sz w:val="44"/>
+                              </w:rPr>
+                              <w:t xml:space="preserve">Fecha </w:t>
+                            </w:r>
+                          </w:p>
+                        </w:txbxContent>
+                      </wps:txbx>
+                      <wps:bodyPr rot="0" vert="horz" wrap="square" lIns="91440" tIns="45720" rIns="91440" bIns="45720" anchor="t" anchorCtr="0">
+                        <a:noAutofit/>
+                      </wps:bodyPr>
+                    </wps:wsp>
+                  </a:graphicData>
+                </a:graphic>
+                <wp14:sizeRelH relativeFrom="margin">
+                  <wp14:pctWidth>0</wp14:pctWidth>
+                </wp14:sizeRelH>
+                <wp14:sizeRelV relativeFrom="margin">
+                  <wp14:pctHeight>0</wp14:pctHeight>
+                </wp14:sizeRelV>
+              </wp:anchor>
+            </w:drawing>
+          </mc:Choice>
+          <mc:Fallback>
+            <w:pict>
+              <v:shape w14:anchorId="16ACA798" id="_x0000_s1037" type="#_x0000_t202" style="position:absolute;margin-left:1.4pt;margin-top:558.25pt;width:102pt;height:52.6pt;z-index:251670528;visibility:visible;mso-wrap-style:square;mso-width-percent:0;mso-height-percent:0;mso-wrap-distance-left:9pt;mso-wrap-distance-top:3.6pt;mso-wrap-distance-right:9pt;mso-wrap-distance-bottom:3.6pt;mso-position-horizontal:absolute;mso-position-horizontal-relative:margin;mso-position-vertical:absolute;mso-position-vertical-relative:text;mso-width-percent:0;mso-height-percent:0;mso-width-relative:margin;mso-height-relative:margin;v-text-anchor:top" o:gfxdata="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" filled="f" stroked="f">
+                <v:textbox>
+                  <w:txbxContent>
+                    <w:p>
+                      <w:pPr>
+                        <w:rPr>
+                          <w:rFonts w:ascii="Delight Candles" w:hAnsi="Delight Candles"/>
+                          <w:b/>
+                          <w:color w:val="385623" w:themeColor="accent6" w:themeShade="80"/>
+                          <w:sz w:val="32"/>
+                        </w:rPr>
+                      </w:pPr>
+                      <w:r>
+                        <w:rPr>
+                          <w:rFonts w:ascii="Delight Candles" w:hAnsi="Delight Candles"/>
+                          <w:b/>
+                          <w:color w:val="385623" w:themeColor="accent6" w:themeShade="80"/>
+                          <w:sz w:val="44"/>
+                        </w:rPr>
+                        <w:t xml:space="preserve">Fecha </w:t>
+                      </w:r>
+                    </w:p>
+                  </w:txbxContent>
+                </v:textbox>
+                <w10:wrap type="square" anchorx="margin"/>
+              </v:shape>
+            </w:pict>
+          </mc:Fallback>
+        </mc:AlternateContent>
+      </w:r>
+      <w:r>
+        <w:rPr>
+          <w:noProof/>
+          <w:lang w:eastAsia="es-MX"/>
+        </w:rPr>
+        <mc:AlternateContent>
+          <mc:Choice Requires="wps">
+            <w:drawing>
+              <wp:anchor distT="45720" distB="45720" distL="114300" distR="114300" simplePos="0" relativeHeight="251671552" behindDoc="0" locked="0" layoutInCell="1" allowOverlap="1" wp14:anchorId="1A4E6056" wp14:editId="4BD28B19">
+                <wp:simplePos x="0" y="0"/>
+                <wp:positionH relativeFrom="margin">
+                  <wp:align>left</wp:align>
+                </wp:positionH>
+                <wp:positionV relativeFrom="paragraph">
+                  <wp:posOffset>6420369</wp:posOffset>
+                </wp:positionV>
+                <wp:extent cx="2116455" cy="575310"/>
+                <wp:effectExtent l="0" t="0" r="0" b="0"/>
+                <wp:wrapSquare wrapText="bothSides"/>
+                <wp:docPr id="21" name="Cuadro de texto 2"/>
+                <wp:cNvGraphicFramePr>
+                  <a:graphicFrameLocks xmlns:a="http://schemas.openxmlformats.org/drawingml/2006/main"/>
+                </wp:cNvGraphicFramePr>
+                <a:graphic xmlns:a="http://schemas.openxmlformats.org/drawingml/2006/main">
+                  <a:graphicData uri="http://schemas.microsoft.com/office/word/2010/wordprocessingShape">
+                    <wps:wsp>
+                      <wps:cNvSpPr txBox="1">
+                        <a:spLocks noChangeArrowheads="1"/>
+                      </wps:cNvSpPr>
+                      <wps:spPr bwMode="auto">
+                        <a:xfrm>
+                          <a:off x="0" y="0"/>
+                          <a:ext cx="2116455" cy="575310"/>
+                        </a:xfrm>
+                        <a:prstGeom prst="rect">
+                          <a:avLst/>
+                        </a:prstGeom>
+                        <a:noFill/>
+                        <a:ln w="9525">
+                          <a:noFill/>
+                          <a:miter lim="800000"/>
+                          <a:headEnd/>
+                          <a:tailEnd/>
+                        </a:ln>
+                      </wps:spPr>
+                      <wps:txbx>
+                        <w:txbxContent>
+                          <w:p>
+                            <w:pPr>
+                              <w:rPr>
+                                <w:rFonts w:ascii="Delight Candles" w:hAnsi="Delight Candles"/>
+                                <w:b/>
+                                <w:color w:val="385623" w:themeColor="accent6" w:themeShade="80"/>
+                                <w:sz w:val="32"/>
+                              </w:rPr>
+                            </w:pPr>
+                            <w:r>
+                              <w:rPr>
+                                <w:rFonts w:ascii="Delight Candles" w:hAnsi="Delight Candles"/>
+                                <w:b/>
+                                <w:color w:val="385623" w:themeColor="accent6" w:themeShade="80"/>
+                                <w:sz w:val="44"/>
+                              </w:rPr>
+                              <w:t>Docente</w:t>
+                            </w:r>
+                          </w:p>
+                        </w:txbxContent>
+                      </wps:txbx>
+                      <wps:bodyPr rot="0" vert="horz" wrap="square" lIns="91440" tIns="45720" rIns="91440" bIns="45720" anchor="t" anchorCtr="0">
+                        <a:noAutofit/>
+                      </wps:bodyPr>
+                    </wps:wsp>
+                  </a:graphicData>
+                </a:graphic>
+                <wp14:sizeRelH relativeFrom="margin">
+                  <wp14:pctWidth>0</wp14:pctWidth>
+                </wp14:sizeRelH>
+                <wp14:sizeRelV relativeFrom="margin">
+                  <wp14:pctHeight>0</wp14:pctHeight>
+                </wp14:sizeRelV>
+              </wp:anchor>
+            </w:drawing>
+          </mc:Choice>
+          <mc:Fallback>
+            <w:pict>
+              <v:shape w14:anchorId="1A4E6056" id="_x0000_s1038" type="#_x0000_t202" style="position:absolute;margin-left:0;margin-top:505.55pt;width:166.65pt;height:45.3pt;z-index:251671552;visibility:visible;mso-wrap-style:square;mso-width-percent:0;mso-height-percent:0;mso-wrap-distance-left:9pt;mso-wrap-distance-top:3.6pt;mso-wrap-distance-right:9pt;mso-wrap-distance-bottom:3.6pt;mso-position-horizontal:left;mso-position-horizontal-relative:margin;mso-position-vertical:absolute;mso-position-vertical-relative:text;mso-width-percent:0;mso-height-percent:0;mso-width-relative:margin;mso-height-relative:margin;v-text-anchor:top" o:gfxdata="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" filled="f" stroked="f">
+                <v:textbox>
+                  <w:txbxContent>
+                    <w:p>
+                      <w:pPr>
+                        <w:rPr>
+                          <w:rFonts w:ascii="Delight Candles" w:hAnsi="Delight Candles"/>
+                          <w:b/>
+                          <w:color w:val="385623" w:themeColor="accent6" w:themeShade="80"/>
+                          <w:sz w:val="32"/>
+                        </w:rPr>
+                      </w:pPr>
+                      <w:r>
+                        <w:rPr>
+                          <w:rFonts w:ascii="Delight Candles" w:hAnsi="Delight Candles"/>
+                          <w:b/>
+                          <w:color w:val="385623" w:themeColor="accent6" w:themeShade="80"/>
+                          <w:sz w:val="44"/>
+                        </w:rPr>
+                        <w:t>Docente</w:t>
+                      </w:r>
+                    </w:p>
+                  </w:txbxContent>
+                </v:textbox>
+                <w10:wrap type="square" anchorx="margin"/>
+              </v:shape>
+            </w:pict>
+          </mc:Fallback>
+        </mc:AlternateContent>
+      </w:r>
+    </w:p>
+    <w:p>
+      <w:r>
+        <w:rPr>
+          <w:noProof/>
+          <w:lang w:eastAsia="es-MX"/>
+        </w:rPr>
+        <mc:AlternateContent>
+          <mc:Choice Requires="wps">
+            <w:drawing>
+              <wp:anchor distT="45720" distB="45720" distL="114300" distR="114300" simplePos="0" relativeHeight="251668480" behindDoc="0" locked="0" layoutInCell="1" allowOverlap="1" wp14:anchorId="54793A34" wp14:editId="49BAC454">
+                <wp:simplePos x="0" y="0"/>
+                <wp:positionH relativeFrom="margin">
+                  <wp:posOffset>739775</wp:posOffset>
+                </wp:positionH>
+                <wp:positionV relativeFrom="paragraph">
+                  <wp:posOffset>1635760</wp:posOffset>
+                </wp:positionV>
+                <wp:extent cx="4734560" cy="411480"/>
+                <wp:effectExtent l="0" t="0" r="0" b="0"/>
+                <wp:wrapSquare wrapText="bothSides"/>
+                <wp:docPr id="20" name="Cuadro de texto 2"/>
+                <wp:cNvGraphicFramePr>
+                  <a:graphicFrameLocks xmlns:a="http://schemas.openxmlformats.org/drawingml/2006/main"/>
+                </wp:cNvGraphicFramePr>
+                <a:graphic xmlns:a="http://schemas.openxmlformats.org/drawingml/2006/main">
+                  <a:graphicData uri="http://schemas.microsoft.com/office/word/2010/wordprocessingShape">
+                    <wps:wsp>
+                      <wps:cNvSpPr txBox="1">
+                        <a:spLocks noChangeArrowheads="1"/>
+                      </wps:cNvSpPr>
+                      <wps:spPr bwMode="auto">
+                        <a:xfrm>
+                          <a:off x="0" y="0"/>
+                          <a:ext cx="4734560" cy="411480"/>
+                        </a:xfrm>
+                        <a:prstGeom prst="rect">
+                          <a:avLst/>
+                        </a:prstGeom>
+                        <a:noFill/>
+                        <a:ln w="9525">
+                          <a:noFill/>
+                          <a:miter lim="800000"/>
+                          <a:headEnd/>
+                          <a:tailEnd/>
+                        </a:ln>
+                      </wps:spPr>
+                      <wps:txbx>
+                        <w:txbxContent>
+                          <w:p>
+                            <w:pPr>
+                              <w:rPr>
+                                <w:rFonts w:ascii="Arial" w:hAnsi="Arial" w:cs="Arial"/>
+                                <w:b/>
+                                <w:color w:val="FF0000"/>
+                                <w:sz w:val="40"/>
+                                <w:szCs w:val="36"/>
+                              </w:rPr>
+                            </w:pPr>
+                            <w:r>
+                              <w:rPr>
+                                <w:rFonts w:ascii="Arial" w:hAnsi="Arial" w:cs="Arial"/>
+                                <w:b/>
+                                <w:color w:val="FF0000"/>
+                                <w:sz w:val="40"/>
+                                <w:szCs w:val="36"/>
+                              </w:rPr>
+                              <w:t>Producto Integrador de Aprendizaje</w:t>
+                            </w:r>
+                          </w:p>
+                        </w:txbxContent>
+                      </wps:txbx>
+                      <wps:bodyPr rot="0" vert="horz" wrap="square" lIns="91440" tIns="45720" rIns="91440" bIns="45720" anchor="t" anchorCtr="0">
+                        <a:noAutofit/>
+                      </wps:bodyPr>
+                    </wps:wsp>
+                  </a:graphicData>
+                </a:graphic>
+                <wp14:sizeRelH relativeFrom="margin">
+                  <wp14:pctWidth>0</wp14:pctWidth>
+                </wp14:sizeRelH>
+                <wp14:sizeRelV relativeFrom="margin">
+                  <wp14:pctHeight>0</wp14:pctHeight>
+                </wp14:sizeRelV>
+              </wp:anchor>
+            </w:drawing>
+          </mc:Choice>
+          <mc:Fallback>
+            <w:pict>
+              <v:shape w14:anchorId="54793A34" id="_x0000_s1039" type="#_x0000_t202" style="position:absolute;margin-left:58.25pt;margin-top:128.8pt;width:372.8pt;height:32.4pt;z-index:251668480;visibility:visible;mso-wrap-style:square;mso-width-percent:0;mso-height-percent:0;mso-wrap-distance-left:9pt;mso-wrap-distance-top:3.6pt;mso-wrap-distance-right:9pt;mso-wrap-distance-bottom:3.6pt;mso-position-horizontal:absolute;mso-position-horizontal-relative:margin;mso-position-vertical:absolute;mso-position-vertical-relative:text;mso-width-percent:0;mso-height-percent:0;mso-width-relative:margin;mso-height-relative:margin;v-text-anchor:top" o:gfxdata="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" filled="f" stroked="f">
+                <v:textbox>
+                  <w:txbxContent>
+                    <w:p>
+                      <w:pPr>
+                        <w:rPr>
+                          <w:rFonts w:ascii="Arial" w:hAnsi="Arial" w:cs="Arial"/>
+                          <w:b/>
+                          <w:color w:val="FF0000"/>
+                          <w:sz w:val="40"/>
+                          <w:szCs w:val="36"/>
+                        </w:rPr>
+                      </w:pPr>
+                      <w:r>
+                        <w:rPr>
+                          <w:rFonts w:ascii="Arial" w:hAnsi="Arial" w:cs="Arial"/>
+                          <w:b/>
+                          <w:color w:val="FF0000"/>
+                          <w:sz w:val="40"/>
+                          <w:szCs w:val="36"/>
+                        </w:rPr>
+                        <w:t>Producto Integrador de Aprendizaje</w:t>
+                      </w:r>
+                    </w:p>
+                  </w:txbxContent>
+                </v:textbox>
+                <w10:wrap type="square" anchorx="margin"/>
+              </v:shape>
+            </w:pict>
+          </mc:Fallback>
+        </mc:AlternateContent>
+      </w:r>
+      <w:r>
+        <w:rPr>
+          <w:noProof/>
+          <w:lang w:eastAsia="es-MX"/>
+        </w:rPr>
+        <mc:AlternateContent>
+          <mc:Choice Requires="wps">
+            <w:drawing>
+              <wp:anchor distT="45720" distB="45720" distL="114300" distR="114300" simplePos="0" relativeHeight="251667456" behindDoc="0" locked="0" layoutInCell="1" allowOverlap="1" wp14:anchorId="64E81AA0" wp14:editId="375261FD">
+                <wp:simplePos x="0" y="0"/>
+                <wp:positionH relativeFrom="page">
+                  <wp:posOffset>3020060</wp:posOffset>
+                </wp:positionH>
+                <wp:positionV relativeFrom="paragraph">
+                  <wp:posOffset>5435600</wp:posOffset>
+                </wp:positionV>
+                <wp:extent cx="3959860" cy="575310"/>
+                <wp:effectExtent l="0" t="0" r="0" b="0"/>
+                <wp:wrapSquare wrapText="bothSides"/>
+                <wp:docPr id="19" name="Cuadro de texto 2"/>
+                <wp:cNvGraphicFramePr>
+                  <a:graphicFrameLocks xmlns:a="http://schemas.openxmlformats.org/drawingml/2006/main"/>
+                </wp:cNvGraphicFramePr>
+                <a:graphic xmlns:a="http://schemas.openxmlformats.org/drawingml/2006/main">
+                  <a:graphicData uri="http://schemas.microsoft.com/office/word/2010/wordprocessingShape">
+                    <wps:wsp>
+                      <wps:cNvSpPr txBox="1">
+                        <a:spLocks noChangeArrowheads="1"/>
+                      </wps:cNvSpPr>
+                      <wps:spPr bwMode="auto">
+                        <a:xfrm>
+                          <a:off x="0" y="0"/>
+                          <a:ext cx="3959860" cy="575310"/>
+                        </a:xfrm>
+                        <a:prstGeom prst="rect">
+                          <a:avLst/>
+                        </a:prstGeom>
+                        <a:noFill/>
+                        <a:ln w="9525">
+                          <a:noFill/>
+                          <a:miter lim="800000"/>
+                          <a:headEnd/>
+                          <a:tailEnd/>
+                        </a:ln>
+                      </wps:spPr>
+                      <wps:txbx>
+                        <w:txbxContent>
+                          <w:p>
+                            <w:pPr>
+                              <w:rPr>
+                                <w:rFonts w:ascii="Arial" w:hAnsi="Arial" w:cs="Arial"/>
+                                <w:sz w:val="40"/>
+                                <w:szCs w:val="36"/>
+                              </w:rPr>
+                            </w:pPr>
+                            <w:r>
+                              <w:rPr>
+                                <w:rFonts w:ascii="Arial" w:hAnsi="Arial" w:cs="Arial"/>
+                                <w:sz w:val="40"/>
+                                <w:szCs w:val="36"/>
+                              </w:rPr>
+                              <w:t>Prácticas Profesionales</w:t>
+                            </w:r>
+                          </w:p>
+                        </w:txbxContent>
+                      </wps:txbx>
+                      <wps:bodyPr rot="0" vert="horz" wrap="square" lIns="91440" tIns="45720" rIns="91440" bIns="45720" anchor="t" anchorCtr="0">
+                        <a:noAutofit/>
+                      </wps:bodyPr>
+                    </wps:wsp>
+                  </a:graphicData>
+                </a:graphic>
+                <wp14:sizeRelH relativeFrom="margin">
+                  <wp14:pctWidth>0</wp14:pctWidth>
+                </wp14:sizeRelH>
+                <wp14:sizeRelV relativeFrom="margin">
+                  <wp14:pctHeight>0</wp14:pctHeight>
+                </wp14:sizeRelV>
+              </wp:anchor>
+            </w:drawing>
+          </mc:Choice>
+          <mc:Fallback>
+            <w:pict>
+              <v:shape w14:anchorId="64E81AA0" id="_x0000_s1040" type="#_x0000_t202" style="position:absolute;margin-left:237.8pt;margin-top:428pt;width:311.8pt;height:45.3pt;z-index:251667456;visibility:visible;mso-wrap-style:square;mso-width-percent:0;mso-height-percent:0;mso-wrap-distance-left:9pt;mso-wrap-distance-top:3.6pt;mso-wrap-distance-right:9pt;mso-wrap-distance-bottom:3.6pt;mso-position-horizontal:absolute;mso-position-horizontal-relative:page;mso-position-vertical:absolute;mso-position-vertical-relative:text;mso-width-percent:0;mso-height-percent:0;mso-width-relative:margin;mso-height-relative:margin;v-text-anchor:top" o:gfxdata="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" filled="f" stroked="f">
+                <v:textbox>
+                  <w:txbxContent>
+                    <w:p>
+                      <w:pPr>
+                        <w:rPr>
+                          <w:rFonts w:ascii="Arial" w:hAnsi="Arial" w:cs="Arial"/>
+                          <w:sz w:val="40"/>
+                          <w:szCs w:val="36"/>
+                        </w:rPr>
+                      </w:pPr>
+                      <w:r>
+                        <w:rPr>
+                          <w:rFonts w:ascii="Arial" w:hAnsi="Arial" w:cs="Arial"/>
+                          <w:sz w:val="40"/>
+                          <w:szCs w:val="36"/>
+                        </w:rPr>
+                        <w:t>Prácticas Profesionales</w:t>
+                      </w:r>
+                    </w:p>
+                  </w:txbxContent>
+                </v:textbox>
+                <w10:wrap type="square" anchorx="page"/>
+              </v:shape>
+            </w:pict>
+          </mc:Fallback>
+        </mc:AlternateContent>
+      </w:r>
+      <w:r>
+        <w:rPr>
+          <w:noProof/>
+          <w:lang w:eastAsia="es-MX"/>
+        </w:rPr>
+        <mc:AlternateContent>
+          <mc:Choice Requires="wps">
+            <w:drawing>
+              <wp:anchor distT="45720" distB="45720" distL="114300" distR="114300" simplePos="0" relativeHeight="251663360" behindDoc="0" locked="0" layoutInCell="1" allowOverlap="1" wp14:anchorId="6E85F608" wp14:editId="243C89EB">
+                <wp:simplePos x="0" y="0"/>
+                <wp:positionH relativeFrom="margin">
+                  <wp:posOffset>0</wp:posOffset>
+                </wp:positionH>
+                <wp:positionV relativeFrom="paragraph">
+                  <wp:posOffset>5327015</wp:posOffset>
+                </wp:positionV>
+                <wp:extent cx="2116455" cy="640080"/>
+                <wp:effectExtent l="0" t="0" r="0" b="0"/>
+                <wp:wrapSquare wrapText="bothSides"/>
+                <wp:docPr id="13" name="Cuadro de texto 2"/>
+                <wp:cNvGraphicFramePr>
+                  <a:graphicFrameLocks xmlns:a="http://schemas.openxmlformats.org/drawingml/2006/main"/>
+                </wp:cNvGraphicFramePr>
+                <a:graphic xmlns:a="http://schemas.openxmlformats.org/drawingml/2006/main">
+                  <a:graphicData uri="http://schemas.microsoft.com/office/word/2010/wordprocessingShape">
+                    <wps:wsp>
+                      <wps:cNvSpPr txBox="1">
+                        <a:spLocks noChangeArrowheads="1"/>
+                      </wps:cNvSpPr>
+                      <wps:spPr bwMode="auto">
+                        <a:xfrm>
+                          <a:off x="0" y="0"/>
+                          <a:ext cx="2116455" cy="640080"/>
+                        </a:xfrm>
+                        <a:prstGeom prst="rect">
+                          <a:avLst/>
+                        </a:prstGeom>
+                        <a:noFill/>
+                        <a:ln w="9525">
+                          <a:noFill/>
+                          <a:miter lim="800000"/>
+                          <a:headEnd/>
+                          <a:tailEnd/>
+                        </a:ln>
+                      </wps:spPr>
+                      <wps:txbx>
+                        <w:txbxContent>
+                          <w:p>
+                            <w:pPr>
+                              <w:rPr>
+                                <w:rFonts w:ascii="Delight Candles" w:hAnsi="Delight Candles"/>
+                                <w:b/>
+                                <w:color w:val="385623" w:themeColor="accent6" w:themeShade="80"/>
+                                <w:sz w:val="32"/>
+                              </w:rPr>
+                            </w:pPr>
+                            <w:r>
+                              <w:rPr>
+                                <w:rFonts w:ascii="Delight Candles" w:hAnsi="Delight Candles"/>
+                                <w:b/>
+                                <w:color w:val="385623" w:themeColor="accent6" w:themeShade="80"/>
+                                <w:sz w:val="44"/>
+                              </w:rPr>
+                              <w:t>Asignatura</w:t>
+                            </w:r>
+                          </w:p>
+                        </w:txbxContent>
+                      </wps:txbx>
+                      <wps:bodyPr rot="0" vert="horz" wrap="square" lIns="91440" tIns="45720" rIns="91440" bIns="45720" anchor="t" anchorCtr="0">
+                        <a:noAutofit/>
+                      </wps:bodyPr>
+                    </wps:wsp>
+                  </a:graphicData>
+                </a:graphic>
+                <wp14:sizeRelH relativeFrom="margin">
+                  <wp14:pctWidth>0</wp14:pctWidth>
+                </wp14:sizeRelH>
+                <wp14:sizeRelV relativeFrom="margin">
+                  <wp14:pctHeight>0</wp14:pctHeight>
+                </wp14:sizeRelV>
+              </wp:anchor>
+            </w:drawing>
+          </mc:Choice>
+          <mc:Fallback>
+            <w:pict>
+              <v:shape w14:anchorId="6E85F608" id="_x0000_s1041" type="#_x0000_t202" style="position:absolute;margin-left:0;margin-top:419.45pt;width:166.65pt;height:50.4pt;z-index:251663360;visibility:visible;mso-wrap-style:square;mso-width-percent:0;mso-height-percent:0;mso-wrap-distance-left:9pt;mso-wrap-distance-top:3.6pt;mso-wrap-distance-right:9pt;mso-wrap-distance-bottom:3.6pt;mso-position-horizontal:absolute;mso-position-horizontal-relative:margin;mso-position-vertical:absolute;mso-position-vertical-relative:text;mso-width-percent:0;mso-height-percent:0;mso-width-relative:margin;mso-height-relative:margin;v-text-anchor:top" o:gfxdata="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" filled="f" stroked="f">
+                <v:textbox>
+                  <w:txbxContent>
+                    <w:p>
+                      <w:pPr>
+                        <w:rPr>
+                          <w:rFonts w:ascii="Delight Candles" w:hAnsi="Delight Candles"/>
+                          <w:b/>
+                          <w:color w:val="385623" w:themeColor="accent6" w:themeShade="80"/>
+                          <w:sz w:val="32"/>
+                        </w:rPr>
+                      </w:pPr>
+                      <w:r>
+                        <w:rPr>
+                          <w:rFonts w:ascii="Delight Candles" w:hAnsi="Delight Candles"/>
+                          <w:b/>
+                          <w:color w:val="385623" w:themeColor="accent6" w:themeShade="80"/>
+                          <w:sz w:val="44"/>
+                        </w:rPr>
+                        <w:t>Asignatura</w:t>
+                      </w:r>
+                    </w:p>
+                  </w:txbxContent>
+                </v:textbox>
+                <w10:wrap type="square" anchorx="margin"/>
+              </v:shape>
+            </w:pict>
+          </mc:Fallback>
+        </mc:AlternateContent>
+      </w:r>
+      <w:r>
+        <w:rPr>
+          <w:noProof/>
+          <w:lang w:eastAsia="es-MX"/>
+        </w:rPr>
+        <mc:AlternateContent>
+          <mc:Choice Requires="wps">
+            <w:drawing>
+              <wp:anchor distT="45720" distB="45720" distL="114300" distR="114300" simplePos="0" relativeHeight="251669504" behindDoc="0" locked="0" layoutInCell="1" allowOverlap="1" wp14:anchorId="197E6DA9" wp14:editId="2241B706">
+                <wp:simplePos x="0" y="0"/>
+                <wp:positionH relativeFrom="margin">
+                  <wp:posOffset>857885</wp:posOffset>
+                </wp:positionH>
+                <wp:positionV relativeFrom="paragraph">
+                  <wp:posOffset>2116455</wp:posOffset>
+                </wp:positionV>
+                <wp:extent cx="4385310" cy="575310"/>
+                <wp:effectExtent l="0" t="0" r="0" b="0"/>
+                <wp:wrapSquare wrapText="bothSides"/>
+                <wp:docPr id="23" name="Cuadro de texto 2"/>
+                <wp:cNvGraphicFramePr>
+                  <a:graphicFrameLocks xmlns:a="http://schemas.openxmlformats.org/drawingml/2006/main"/>
+                </wp:cNvGraphicFramePr>
+                <a:graphic xmlns:a="http://schemas.openxmlformats.org/drawingml/2006/main">
+                  <a:graphicData uri="http://schemas.microsoft.com/office/word/2010/wordprocessingShape">
+                    <wps:wsp>
+                      <wps:cNvSpPr txBox="1">
+                        <a:spLocks noChangeArrowheads="1"/>
+                      </wps:cNvSpPr>
+                      <wps:spPr bwMode="auto">
+                        <a:xfrm>
+                          <a:off x="0" y="0"/>
+                          <a:ext cx="4385310" cy="575310"/>
+                        </a:xfrm>
+                        <a:prstGeom prst="rect">
+                          <a:avLst/>
+                        </a:prstGeom>
+                        <a:noFill/>
+                        <a:ln w="9525">
+                          <a:noFill/>
+                          <a:miter lim="800000"/>
+                          <a:headEnd/>
+                          <a:tailEnd/>
+                        </a:ln>
+                      </wps:spPr>
+                      <wps:txbx>
+                        <w:txbxContent>
+                          <w:p>
+                            <w:pPr>
+                              <w:jc w:val="center"/>
+                              <w:rPr>
+                                <w:rFonts w:ascii="Arial" w:hAnsi="Arial" w:cs="Arial"/>
+                                <w:color w:val="FF0000"/>
+                                <w:sz w:val="36"/>
+                                <w:szCs w:val="32"/>
+                              </w:rPr>
+                            </w:pPr>
+                            <w:r>
+                              <w:rPr>
+                                <w:rFonts w:ascii="Arial" w:hAnsi="Arial" w:cs="Arial"/>
+                                <w:color w:val="FF0000"/>
+                                <w:sz w:val="36"/>
+                                <w:szCs w:val="32"/>
+                              </w:rPr>
+                              <w:t>Propuesta de mejora o solución</w:t>
+                            </w:r>
+                          </w:p>
+                        </w:txbxContent>
+                      </wps:txbx>
+                      <wps:bodyPr rot="0" vert="horz" wrap="square" lIns="91440" tIns="45720" rIns="91440" bIns="45720" anchor="t" anchorCtr="0">
+                        <a:noAutofit/>
+                      </wps:bodyPr>
+                    </wps:wsp>
+                  </a:graphicData>
+                </a:graphic>
+                <wp14:sizeRelH relativeFrom="margin">
+                  <wp14:pctWidth>0</wp14:pctWidth>
+                </wp14:sizeRelH>
+                <wp14:sizeRelV relativeFrom="margin">
+                  <wp14:pctHeight>0</wp14:pctHeight>
+                </wp14:sizeRelV>
+              </wp:anchor>
+            </w:drawing>
+          </mc:Choice>
+          <mc:Fallback>
+            <w:pict>
+              <v:shape w14:anchorId="197E6DA9" id="_x0000_s1042" type="#_x0000_t202" style="position:absolute;margin-left:67.55pt;margin-top:166.65pt;width:345.3pt;height:45.3pt;z-index:251669504;visibility:visible;mso-wrap-style:square;mso-width-percent:0;mso-height-percent:0;mso-wrap-distance-left:9pt;mso-wrap-distance-top:3.6pt;mso-wrap-distance-right:9pt;mso-wrap-distance-bottom:3.6pt;mso-position-horizontal:absolute;mso-position-horizontal-relative:margin;mso-position-vertical:absolute;mso-position-vertical-relative:text;mso-width-percent:0;mso-height-percent:0;mso-width-relative:margin;mso-height-relative:margin;v-text-anchor:top" o:gfxdata="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" filled="f" stroked="f">
+                <v:textbox>
+                  <w:txbxContent>
+                    <w:p>
+                      <w:pPr>
+                        <w:jc w:val="center"/>
+                        <w:rPr>
+                          <w:rFonts w:ascii="Arial" w:hAnsi="Arial" w:cs="Arial"/>
+                          <w:color w:val="FF0000"/>
+                          <w:sz w:val="36"/>
+                          <w:szCs w:val="32"/>
+                        </w:rPr>
+                      </w:pPr>
+                      <w:r>
+                        <w:rPr>
+                          <w:rFonts w:ascii="Arial" w:hAnsi="Arial" w:cs="Arial"/>
+                          <w:color w:val="FF0000"/>
+                          <w:sz w:val="36"/>
+                          <w:szCs w:val="32"/>
+                        </w:rPr>
+                        <w:t>Propuesta de mejora o solución</w:t>
+                      </w:r>
+                    </w:p>
+                  </w:txbxContent>
+                </v:textbox>
+                <w10:wrap type="square" anchorx="margin"/>
+              </v:shape>
+            </w:pict>
+          </mc:Fallback>
+        </mc:AlternateContent>
+      </w:r>
+      <w:r>
+        <w:br w:type="page"/>
+      </w:r>
+    </w:p>
+    <w:p>
+      <w:pPr>
+        <w:rPr>
+          <w:rFonts w:ascii="Roboto" w:hAnsi="Roboto"/>
+          <w:sz w:val="27"/>
+          <w:szCs w:val="27"/>
+          <w:shd w:val="clear" w:color="auto" w:fill="FFFFFF"/>
+        </w:rPr>
+      </w:pPr>
+      <w:r>
+        <w:rPr>
+          <w:rFonts w:ascii="Roboto" w:hAnsi="Roboto"/>
+          <w:sz w:val="27"/>
+          <w:szCs w:val="27"/>
+          <w:shd w:val="clear" w:color="auto" w:fill="FFFFFF"/>
+        </w:rPr>
+        <w:lastRenderedPageBreak/>
+        <w:t xml:space="preserve">Para este proyecto se nos pide una propuesta de mejora o solución de un área de oportunidad o problema a resolver, pero </w:t>
+      </w:r>
+      <w:r>
+        <w:rPr>
+          <w:rFonts w:ascii="Roboto" w:hAnsi="Roboto"/>
+          <w:sz w:val="27"/>
+          <w:szCs w:val="27"/>
+          <w:shd w:val="clear" w:color="auto" w:fill="FFFFFF"/>
+        </w:rPr>
+        <w:t xml:space="preserve">en una </w:t>
+      </w:r>
+      <w:proofErr w:type="gramStart"/>
+      <w:r>
+        <w:rPr>
+          <w:rFonts w:ascii="Roboto" w:hAnsi="Roboto"/>
+          <w:sz w:val="27"/>
+          <w:szCs w:val="27"/>
+          <w:shd w:val="clear" w:color="auto" w:fill="FFFFFF"/>
+        </w:rPr>
+        <w:t>primer idea</w:t>
+      </w:r>
+      <w:proofErr w:type="gramEnd"/>
+      <w:r>
+        <w:rPr>
+          <w:rFonts w:ascii="Roboto" w:hAnsi="Roboto"/>
+          <w:sz w:val="27"/>
+          <w:szCs w:val="27"/>
+          <w:shd w:val="clear" w:color="auto" w:fill="FFFFFF"/>
+        </w:rPr>
+        <w:t xml:space="preserve"> sobre lo que hago aquí; en el </w:t>
+      </w:r>
+      <w:r>
+        <w:rPr>
+          <w:rFonts w:ascii="Roboto" w:hAnsi="Roboto"/>
+          <w:i/>
+          <w:sz w:val="27"/>
+          <w:szCs w:val="27"/>
+          <w:shd w:val="clear" w:color="auto" w:fill="FFFFFF"/>
+        </w:rPr>
+        <w:t xml:space="preserve">Laboratorio de Realidad Virtual e </w:t>
+      </w:r>
+      <w:proofErr w:type="spellStart"/>
+      <w:r>
+        <w:rPr>
+          <w:rFonts w:ascii="Roboto" w:hAnsi="Roboto"/>
+          <w:i/>
+          <w:sz w:val="27"/>
+          <w:szCs w:val="27"/>
+          <w:shd w:val="clear" w:color="auto" w:fill="FFFFFF"/>
+        </w:rPr>
+        <w:t>Inmersiva</w:t>
+      </w:r>
+      <w:proofErr w:type="spellEnd"/>
+      <w:r>
+        <w:rPr>
+          <w:rFonts w:ascii="Roboto" w:hAnsi="Roboto"/>
+          <w:i/>
+          <w:sz w:val="27"/>
+          <w:szCs w:val="27"/>
+          <w:shd w:val="clear" w:color="auto" w:fill="FFFFFF"/>
+        </w:rPr>
+        <w:t xml:space="preserve">, </w:t>
+      </w:r>
+      <w:r>
+        <w:rPr>
+          <w:rFonts w:ascii="Roboto" w:hAnsi="Roboto"/>
+          <w:sz w:val="27"/>
+          <w:szCs w:val="27"/>
+          <w:shd w:val="clear" w:color="auto" w:fill="FFFFFF"/>
+        </w:rPr>
+        <w:t xml:space="preserve">tengo la sensación de que no tengo acceso a soluciones reales y suficientemente prácticas en el mundo real. Todo el tiempo se nos pide que hagamos el enfoque sobre cómo utilizar estas sofisticadas, valiosas y exóticas tecnologías en capacitación para ahorrarle dinero a las empresas en seguridad y material, o sobre cómo utilizarla por ejemplo en áreas entrenamiento médico, entre muchas otras. Pero, si soy incómodamente honesto con lo que he hecho hasta ahora, siento que son la respuesta correcta a la pregunta equivocada. </w:t>
+      </w:r>
+      <w:r>
+        <w:rPr>
+          <w:rFonts w:ascii="Roboto" w:hAnsi="Roboto"/>
+          <w:sz w:val="27"/>
+          <w:szCs w:val="27"/>
+          <w:shd w:val="clear" w:color="auto" w:fill="FFFFFF"/>
+        </w:rPr>
+        <w:t xml:space="preserve">Que estos temas están cubiertos por completo y </w:t>
+      </w:r>
+      <w:proofErr w:type="gramStart"/>
+      <w:r>
+        <w:rPr>
+          <w:rFonts w:ascii="Roboto" w:hAnsi="Roboto"/>
+          <w:sz w:val="27"/>
+          <w:szCs w:val="27"/>
+          <w:shd w:val="clear" w:color="auto" w:fill="FFFFFF"/>
+        </w:rPr>
+        <w:t>que</w:t>
+      </w:r>
+      <w:proofErr w:type="gramEnd"/>
+      <w:r>
+        <w:rPr>
+          <w:rFonts w:ascii="Roboto" w:hAnsi="Roboto"/>
+          <w:sz w:val="27"/>
+          <w:szCs w:val="27"/>
+          <w:shd w:val="clear" w:color="auto" w:fill="FFFFFF"/>
+        </w:rPr>
+        <w:t xml:space="preserve"> en el fondo, todos sabemos lo poco práctico que es utilizar un juguete caro para formar profesionales. Esto sirve para demostraciones bonitas e investigación de potencial, entonces de eso haré esta investigación. Del potencial de las tecnologías para resolver un problema. ¿Qué problema?:</w:t>
+      </w:r>
+    </w:p>
+    <w:p>
+      <w:pPr>
+        <w:rPr>
+          <w:rFonts w:ascii="Roboto" w:hAnsi="Roboto"/>
+          <w:sz w:val="27"/>
+          <w:szCs w:val="27"/>
+          <w:shd w:val="clear" w:color="auto" w:fill="FFFFFF"/>
+        </w:rPr>
+      </w:pPr>
+      <w:r>
+        <w:rPr>
+          <w:rFonts w:ascii="Roboto" w:hAnsi="Roboto"/>
+          <w:sz w:val="27"/>
+          <w:szCs w:val="27"/>
+          <w:shd w:val="clear" w:color="auto" w:fill="FFFFFF"/>
+        </w:rPr>
+        <w:t>Elegiré</w:t>
+      </w:r>
+      <w:r>
+        <w:rPr>
+          <w:rFonts w:ascii="Roboto" w:hAnsi="Roboto"/>
+          <w:sz w:val="27"/>
+          <w:szCs w:val="27"/>
+          <w:shd w:val="clear" w:color="auto" w:fill="FFFFFF"/>
+        </w:rPr>
+        <w:t xml:space="preserve"> desde la comodidad de la experiencia y el ambiente bibliográfico que logré construir con mi proyecto interno de prácticas profesionales, el área de la inclusión y el uso de las te</w:t>
+      </w:r>
       <w:bookmarkStart w:id="0" w:name="_GoBack"/>
       <w:bookmarkEnd w:id="0"/>
+      <w:r>
+        <w:rPr>
+          <w:rFonts w:ascii="Roboto" w:hAnsi="Roboto"/>
+          <w:sz w:val="27"/>
+          <w:szCs w:val="27"/>
+          <w:shd w:val="clear" w:color="auto" w:fill="FFFFFF"/>
+        </w:rPr>
+        <w:t xml:space="preserve">cnologías para </w:t>
+      </w:r>
+      <w:r>
+        <w:rPr>
+          <w:rFonts w:ascii="Roboto" w:hAnsi="Roboto"/>
+          <w:i/>
+          <w:sz w:val="27"/>
+          <w:szCs w:val="27"/>
+          <w:shd w:val="clear" w:color="auto" w:fill="FFFFFF"/>
+        </w:rPr>
+        <w:t>rehabilitación física</w:t>
+      </w:r>
+      <w:r>
+        <w:rPr>
+          <w:rFonts w:ascii="Roboto" w:hAnsi="Roboto"/>
+          <w:sz w:val="27"/>
+          <w:szCs w:val="27"/>
+          <w:shd w:val="clear" w:color="auto" w:fill="FFFFFF"/>
+        </w:rPr>
+        <w:t>.</w:t>
+      </w:r>
+    </w:p>
+    <w:p>
+      <w:pPr>
+        <w:rPr>
+          <w:rFonts w:ascii="Roboto" w:hAnsi="Roboto"/>
+          <w:sz w:val="27"/>
+          <w:szCs w:val="27"/>
+          <w:shd w:val="clear" w:color="auto" w:fill="FFFFFF"/>
+        </w:rPr>
+      </w:pPr>
+      <w:r>
+        <w:rPr>
+          <w:rFonts w:ascii="Roboto" w:hAnsi="Roboto"/>
+          <w:sz w:val="27"/>
+          <w:szCs w:val="27"/>
+          <w:shd w:val="clear" w:color="auto" w:fill="FFFFFF"/>
+        </w:rPr>
+        <w:t>Delimitación y justificación del problema</w:t>
+      </w:r>
+      <w:r>
+        <w:rPr>
+          <w:rFonts w:ascii="Roboto" w:hAnsi="Roboto"/>
+          <w:sz w:val="27"/>
+          <w:szCs w:val="27"/>
+          <w:shd w:val="clear" w:color="auto" w:fill="FFFFFF"/>
+        </w:rPr>
+        <w:t xml:space="preserve"> </w:t>
+      </w:r>
+    </w:p>
+    <w:p>
+      <w:r>
+        <w:rPr>
+          <w:rFonts w:ascii="Roboto" w:hAnsi="Roboto"/>
+          <w:sz w:val="27"/>
+          <w:szCs w:val="27"/>
+          <w:shd w:val="clear" w:color="auto" w:fill="FFFFFF"/>
+        </w:rPr>
+        <w:t>Esta investigación o propuesta fue inicialmente tomada de la propuesta de proyecto del propio proyecto</w:t>
+      </w:r>
+      <w:r>
+        <w:rPr>
+          <w:rFonts w:ascii="Roboto" w:hAnsi="Roboto"/>
+          <w:sz w:val="27"/>
+          <w:szCs w:val="27"/>
+          <w:shd w:val="clear" w:color="auto" w:fill="FFFFFF"/>
+        </w:rPr>
+        <w:t xml:space="preserve"> de </w:t>
+      </w:r>
+      <w:r>
+        <w:rPr>
+          <w:rFonts w:ascii="Roboto" w:hAnsi="Roboto"/>
+          <w:i/>
+          <w:sz w:val="27"/>
+          <w:szCs w:val="27"/>
+          <w:shd w:val="clear" w:color="auto" w:fill="FFFFFF"/>
+        </w:rPr>
+        <w:t>Rehabilitación SlimeVR</w:t>
+      </w:r>
+      <w:r>
+        <w:rPr>
+          <w:rFonts w:ascii="Roboto" w:hAnsi="Roboto"/>
+          <w:sz w:val="27"/>
+          <w:szCs w:val="27"/>
+          <w:shd w:val="clear" w:color="auto" w:fill="FFFFFF"/>
+        </w:rPr>
+        <w:t xml:space="preserve"> que desarrollamos en el Laboratorio de Realidad Virtual e </w:t>
+      </w:r>
+      <w:proofErr w:type="spellStart"/>
+      <w:r>
+        <w:rPr>
+          <w:rFonts w:ascii="Roboto" w:hAnsi="Roboto"/>
+          <w:sz w:val="27"/>
+          <w:szCs w:val="27"/>
+          <w:shd w:val="clear" w:color="auto" w:fill="FFFFFF"/>
+        </w:rPr>
+        <w:t>Inmersiva</w:t>
+      </w:r>
+      <w:proofErr w:type="spellEnd"/>
+      <w:r>
+        <w:rPr>
+          <w:rFonts w:ascii="Roboto" w:hAnsi="Roboto"/>
+          <w:sz w:val="27"/>
+          <w:szCs w:val="27"/>
+          <w:shd w:val="clear" w:color="auto" w:fill="FFFFFF"/>
+        </w:rPr>
+        <w:t xml:space="preserve"> de FIME. </w:t>
+      </w:r>
+      <w:r>
+        <w:rPr>
+          <w:rFonts w:ascii="Roboto" w:hAnsi="Roboto"/>
+          <w:sz w:val="27"/>
+          <w:szCs w:val="27"/>
+          <w:shd w:val="clear" w:color="auto" w:fill="FFFFFF"/>
+        </w:rPr>
+        <w:t xml:space="preserve"> </w:t>
+      </w:r>
     </w:p>
     <w:sectPr>
       <w:pgSz w:w="12240" w:h="15840"/>
@@ -409,6 +2799,11 @@
   <w:style w:type="paragraph" w:default="1" w:styleId="Normal">
     <w:name w:val="Normal"/>
     <w:qFormat/>
+    <w:rsid w:val="006A682B"/>
+    <w:rPr>
+      <w:kern w:val="2"/>
+      <w14:ligatures w14:val="standardContextual"/>
+    </w:rPr>
   </w:style>
   <w:style w:type="character" w:default="1" w:styleId="Fuentedeprrafopredeter">
     <w:name w:val="Default Paragraph Font"/>

</xml_diff>